<commit_message>
feat(oos-262329): update Table 2 EM data from decoded 14-page raw package per Rule 46 and Section 67
</commit_message>
<xml_diff>
--- a/Tables OOS-262329 GoGoMeds Select (E10747) - USP71.docx
+++ b/Tables OOS-262329 GoGoMeds Select (E10747) - USP71.docx
@@ -1562,7 +1562,7 @@
                 <w:i w:val="0"/>
                 <w:sz w:val="14"/>
               </w:rPr>
-              <w:t>GL</w:t>
+              <w:t>AOD</w:t>
             </w:r>
           </w:p>
         </w:tc>
@@ -2048,7 +2048,7 @@
                 <w:i w:val="0"/>
                 <w:sz w:val="14"/>
               </w:rPr>
-              <w:t>GL</w:t>
+              <w:t>AOD</w:t>
             </w:r>
           </w:p>
         </w:tc>
@@ -2291,7 +2291,7 @@
                 <w:i w:val="0"/>
                 <w:sz w:val="14"/>
               </w:rPr>
-              <w:t>GL</w:t>
+              <w:t>AOD</w:t>
             </w:r>
           </w:p>
         </w:tc>
@@ -2777,7 +2777,7 @@
                 <w:i w:val="0"/>
                 <w:sz w:val="14"/>
               </w:rPr>
-              <w:t>GL</w:t>
+              <w:t>AOD</w:t>
             </w:r>
           </w:p>
         </w:tc>
@@ -3162,7 +3162,7 @@
                 <w:i w:val="0"/>
                 <w:sz w:val="14"/>
               </w:rPr>
-              <w:t>Pending Identification</w:t>
+              <w:t>Pending</w:t>
             </w:r>
           </w:p>
         </w:tc>

</xml_diff>

<commit_message>
feat(oos-262329): update ETX-261001-0625 morphology and microbial IDs in Table 2 and narrative
</commit_message>
<xml_diff>
--- a/Tables OOS-262329 GoGoMeds Select (E10747) - USP71.docx
+++ b/Tables OOS-262329 GoGoMeds Select (E10747) - USP71.docx
@@ -43,10 +43,10 @@
             <w:tcW w:type="dxa" w:w="1728"/>
             <w:vAlign w:val="center"/>
             <w:tcMar>
-              <w:top w:w="30" w:type="dxa"/>
-              <w:bottom w:w="30" w:type="dxa"/>
-              <w:left w:w="45" w:type="dxa"/>
-              <w:right w:w="45" w:type="dxa"/>
+              <w:top w:w="25" w:type="dxa"/>
+              <w:bottom w:w="25" w:type="dxa"/>
+              <w:left w:w="40" w:type="dxa"/>
+              <w:right w:w="40" w:type="dxa"/>
             </w:tcMar>
           </w:tcPr>
           <w:p>
@@ -70,10 +70,10 @@
             <w:tcW w:type="dxa" w:w="1728"/>
             <w:vAlign w:val="center"/>
             <w:tcMar>
-              <w:top w:w="30" w:type="dxa"/>
-              <w:bottom w:w="30" w:type="dxa"/>
-              <w:left w:w="45" w:type="dxa"/>
-              <w:right w:w="45" w:type="dxa"/>
+              <w:top w:w="25" w:type="dxa"/>
+              <w:bottom w:w="25" w:type="dxa"/>
+              <w:left w:w="40" w:type="dxa"/>
+              <w:right w:w="40" w:type="dxa"/>
             </w:tcMar>
           </w:tcPr>
           <w:p>
@@ -97,10 +97,10 @@
             <w:tcW w:type="dxa" w:w="1800"/>
             <w:vAlign w:val="center"/>
             <w:tcMar>
-              <w:top w:w="30" w:type="dxa"/>
-              <w:bottom w:w="30" w:type="dxa"/>
-              <w:left w:w="45" w:type="dxa"/>
-              <w:right w:w="45" w:type="dxa"/>
+              <w:top w:w="25" w:type="dxa"/>
+              <w:bottom w:w="25" w:type="dxa"/>
+              <w:left w:w="40" w:type="dxa"/>
+              <w:right w:w="40" w:type="dxa"/>
             </w:tcMar>
           </w:tcPr>
           <w:p>
@@ -124,10 +124,10 @@
             <w:tcW w:type="dxa" w:w="1584"/>
             <w:vAlign w:val="center"/>
             <w:tcMar>
-              <w:top w:w="30" w:type="dxa"/>
-              <w:bottom w:w="30" w:type="dxa"/>
-              <w:left w:w="45" w:type="dxa"/>
-              <w:right w:w="45" w:type="dxa"/>
+              <w:top w:w="25" w:type="dxa"/>
+              <w:bottom w:w="25" w:type="dxa"/>
+              <w:left w:w="40" w:type="dxa"/>
+              <w:right w:w="40" w:type="dxa"/>
             </w:tcMar>
           </w:tcPr>
           <w:p>
@@ -151,10 +151,10 @@
             <w:tcW w:type="dxa" w:w="1656"/>
             <w:vAlign w:val="center"/>
             <w:tcMar>
-              <w:top w:w="30" w:type="dxa"/>
-              <w:bottom w:w="30" w:type="dxa"/>
-              <w:left w:w="45" w:type="dxa"/>
-              <w:right w:w="45" w:type="dxa"/>
+              <w:top w:w="25" w:type="dxa"/>
+              <w:bottom w:w="25" w:type="dxa"/>
+              <w:left w:w="40" w:type="dxa"/>
+              <w:right w:w="40" w:type="dxa"/>
             </w:tcMar>
           </w:tcPr>
           <w:p>
@@ -178,10 +178,10 @@
             <w:tcW w:type="dxa" w:w="2304"/>
             <w:vAlign w:val="center"/>
             <w:tcMar>
-              <w:top w:w="30" w:type="dxa"/>
-              <w:bottom w:w="30" w:type="dxa"/>
-              <w:left w:w="45" w:type="dxa"/>
-              <w:right w:w="45" w:type="dxa"/>
+              <w:top w:w="25" w:type="dxa"/>
+              <w:bottom w:w="25" w:type="dxa"/>
+              <w:left w:w="40" w:type="dxa"/>
+              <w:right w:w="40" w:type="dxa"/>
             </w:tcMar>
           </w:tcPr>
           <w:p>
@@ -207,10 +207,10 @@
             <w:tcW w:type="dxa" w:w="1728"/>
             <w:vAlign w:val="center"/>
             <w:tcMar>
-              <w:top w:w="30" w:type="dxa"/>
-              <w:bottom w:w="30" w:type="dxa"/>
-              <w:left w:w="45" w:type="dxa"/>
-              <w:right w:w="45" w:type="dxa"/>
+              <w:top w:w="25" w:type="dxa"/>
+              <w:bottom w:w="25" w:type="dxa"/>
+              <w:left w:w="40" w:type="dxa"/>
+              <w:right w:w="40" w:type="dxa"/>
             </w:tcMar>
           </w:tcPr>
           <w:p>
@@ -234,10 +234,10 @@
             <w:tcW w:type="dxa" w:w="1728"/>
             <w:vAlign w:val="center"/>
             <w:tcMar>
-              <w:top w:w="30" w:type="dxa"/>
-              <w:bottom w:w="30" w:type="dxa"/>
-              <w:left w:w="45" w:type="dxa"/>
-              <w:right w:w="45" w:type="dxa"/>
+              <w:top w:w="25" w:type="dxa"/>
+              <w:bottom w:w="25" w:type="dxa"/>
+              <w:left w:w="40" w:type="dxa"/>
+              <w:right w:w="40" w:type="dxa"/>
             </w:tcMar>
           </w:tcPr>
           <w:p>
@@ -261,10 +261,10 @@
             <w:tcW w:type="dxa" w:w="1800"/>
             <w:vAlign w:val="center"/>
             <w:tcMar>
-              <w:top w:w="30" w:type="dxa"/>
-              <w:bottom w:w="30" w:type="dxa"/>
-              <w:left w:w="45" w:type="dxa"/>
-              <w:right w:w="45" w:type="dxa"/>
+              <w:top w:w="25" w:type="dxa"/>
+              <w:bottom w:w="25" w:type="dxa"/>
+              <w:left w:w="40" w:type="dxa"/>
+              <w:right w:w="40" w:type="dxa"/>
             </w:tcMar>
           </w:tcPr>
           <w:p>
@@ -291,10 +291,10 @@
             <w:tcW w:type="dxa" w:w="1584"/>
             <w:vAlign w:val="center"/>
             <w:tcMar>
-              <w:top w:w="30" w:type="dxa"/>
-              <w:bottom w:w="30" w:type="dxa"/>
-              <w:left w:w="45" w:type="dxa"/>
-              <w:right w:w="45" w:type="dxa"/>
+              <w:top w:w="25" w:type="dxa"/>
+              <w:bottom w:w="25" w:type="dxa"/>
+              <w:left w:w="40" w:type="dxa"/>
+              <w:right w:w="40" w:type="dxa"/>
             </w:tcMar>
           </w:tcPr>
           <w:p>
@@ -321,10 +321,10 @@
             <w:tcW w:type="dxa" w:w="1656"/>
             <w:vAlign w:val="center"/>
             <w:tcMar>
-              <w:top w:w="30" w:type="dxa"/>
-              <w:bottom w:w="30" w:type="dxa"/>
-              <w:left w:w="45" w:type="dxa"/>
-              <w:right w:w="45" w:type="dxa"/>
+              <w:top w:w="25" w:type="dxa"/>
+              <w:bottom w:w="25" w:type="dxa"/>
+              <w:left w:w="40" w:type="dxa"/>
+              <w:right w:w="40" w:type="dxa"/>
             </w:tcMar>
           </w:tcPr>
           <w:p>
@@ -348,10 +348,10 @@
             <w:tcW w:type="dxa" w:w="2304"/>
             <w:vAlign w:val="center"/>
             <w:tcMar>
-              <w:top w:w="30" w:type="dxa"/>
-              <w:bottom w:w="30" w:type="dxa"/>
-              <w:left w:w="45" w:type="dxa"/>
-              <w:right w:w="45" w:type="dxa"/>
+              <w:top w:w="25" w:type="dxa"/>
+              <w:bottom w:w="25" w:type="dxa"/>
+              <w:left w:w="40" w:type="dxa"/>
+              <w:right w:w="40" w:type="dxa"/>
             </w:tcMar>
           </w:tcPr>
           <w:p>
@@ -374,7 +374,7 @@
     </w:tbl>
     <w:p>
       <w:pPr>
-        <w:spacing w:before="120" w:after="0"/>
+        <w:spacing w:before="80" w:after="0"/>
       </w:pPr>
     </w:p>
     <w:p>
@@ -421,10 +421,10 @@
             <w:tcW w:type="dxa" w:w="1728"/>
             <w:vAlign w:val="center"/>
             <w:tcMar>
-              <w:top w:w="30" w:type="dxa"/>
-              <w:bottom w:w="30" w:type="dxa"/>
-              <w:left w:w="45" w:type="dxa"/>
-              <w:right w:w="45" w:type="dxa"/>
+              <w:top w:w="25" w:type="dxa"/>
+              <w:bottom w:w="25" w:type="dxa"/>
+              <w:left w:w="40" w:type="dxa"/>
+              <w:right w:w="40" w:type="dxa"/>
             </w:tcMar>
           </w:tcPr>
           <w:p>
@@ -452,10 +452,10 @@
             <w:tcW w:type="dxa" w:w="792"/>
             <w:vAlign w:val="center"/>
             <w:tcMar>
-              <w:top w:w="30" w:type="dxa"/>
-              <w:bottom w:w="30" w:type="dxa"/>
-              <w:left w:w="45" w:type="dxa"/>
-              <w:right w:w="45" w:type="dxa"/>
+              <w:top w:w="25" w:type="dxa"/>
+              <w:bottom w:w="25" w:type="dxa"/>
+              <w:left w:w="40" w:type="dxa"/>
+              <w:right w:w="40" w:type="dxa"/>
             </w:tcMar>
           </w:tcPr>
           <w:p>
@@ -479,10 +479,10 @@
             <w:tcW w:type="dxa" w:w="864"/>
             <w:vAlign w:val="center"/>
             <w:tcMar>
-              <w:top w:w="30" w:type="dxa"/>
-              <w:bottom w:w="30" w:type="dxa"/>
-              <w:left w:w="45" w:type="dxa"/>
-              <w:right w:w="45" w:type="dxa"/>
+              <w:top w:w="25" w:type="dxa"/>
+              <w:bottom w:w="25" w:type="dxa"/>
+              <w:left w:w="40" w:type="dxa"/>
+              <w:right w:w="40" w:type="dxa"/>
             </w:tcMar>
           </w:tcPr>
           <w:p>
@@ -508,10 +508,10 @@
             <w:tcW w:type="dxa" w:w="720"/>
             <w:vAlign w:val="center"/>
             <w:tcMar>
-              <w:top w:w="30" w:type="dxa"/>
-              <w:bottom w:w="30" w:type="dxa"/>
-              <w:left w:w="45" w:type="dxa"/>
-              <w:right w:w="45" w:type="dxa"/>
+              <w:top w:w="25" w:type="dxa"/>
+              <w:bottom w:w="25" w:type="dxa"/>
+              <w:left w:w="40" w:type="dxa"/>
+              <w:right w:w="40" w:type="dxa"/>
             </w:tcMar>
           </w:tcPr>
           <w:p>
@@ -535,10 +535,10 @@
             <w:tcW w:type="dxa" w:w="1368"/>
             <w:vAlign w:val="center"/>
             <w:tcMar>
-              <w:top w:w="30" w:type="dxa"/>
-              <w:bottom w:w="30" w:type="dxa"/>
-              <w:left w:w="45" w:type="dxa"/>
-              <w:right w:w="45" w:type="dxa"/>
+              <w:top w:w="25" w:type="dxa"/>
+              <w:bottom w:w="25" w:type="dxa"/>
+              <w:left w:w="40" w:type="dxa"/>
+              <w:right w:w="40" w:type="dxa"/>
             </w:tcMar>
           </w:tcPr>
           <w:p>
@@ -562,10 +562,10 @@
             <w:tcW w:type="dxa" w:w="1368"/>
             <w:vAlign w:val="center"/>
             <w:tcMar>
-              <w:top w:w="30" w:type="dxa"/>
-              <w:bottom w:w="30" w:type="dxa"/>
-              <w:left w:w="45" w:type="dxa"/>
-              <w:right w:w="45" w:type="dxa"/>
+              <w:top w:w="25" w:type="dxa"/>
+              <w:bottom w:w="25" w:type="dxa"/>
+              <w:left w:w="40" w:type="dxa"/>
+              <w:right w:w="40" w:type="dxa"/>
             </w:tcMar>
           </w:tcPr>
           <w:p>
@@ -589,10 +589,10 @@
             <w:tcW w:type="dxa" w:w="1368"/>
             <w:vAlign w:val="center"/>
             <w:tcMar>
-              <w:top w:w="30" w:type="dxa"/>
-              <w:bottom w:w="30" w:type="dxa"/>
-              <w:left w:w="45" w:type="dxa"/>
-              <w:right w:w="45" w:type="dxa"/>
+              <w:top w:w="25" w:type="dxa"/>
+              <w:bottom w:w="25" w:type="dxa"/>
+              <w:left w:w="40" w:type="dxa"/>
+              <w:right w:w="40" w:type="dxa"/>
             </w:tcMar>
           </w:tcPr>
           <w:p>
@@ -616,10 +616,10 @@
             <w:tcW w:type="dxa" w:w="1728"/>
             <w:vAlign w:val="center"/>
             <w:tcMar>
-              <w:top w:w="30" w:type="dxa"/>
-              <w:bottom w:w="30" w:type="dxa"/>
-              <w:left w:w="45" w:type="dxa"/>
-              <w:right w:w="45" w:type="dxa"/>
+              <w:top w:w="25" w:type="dxa"/>
+              <w:bottom w:w="25" w:type="dxa"/>
+              <w:left w:w="40" w:type="dxa"/>
+              <w:right w:w="40" w:type="dxa"/>
             </w:tcMar>
           </w:tcPr>
           <w:p>
@@ -643,10 +643,10 @@
             <w:tcW w:type="dxa" w:w="864"/>
             <w:vAlign w:val="center"/>
             <w:tcMar>
-              <w:top w:w="30" w:type="dxa"/>
-              <w:bottom w:w="30" w:type="dxa"/>
-              <w:left w:w="45" w:type="dxa"/>
-              <w:right w:w="45" w:type="dxa"/>
+              <w:top w:w="25" w:type="dxa"/>
+              <w:bottom w:w="25" w:type="dxa"/>
+              <w:left w:w="40" w:type="dxa"/>
+              <w:right w:w="40" w:type="dxa"/>
             </w:tcMar>
           </w:tcPr>
           <w:p>
@@ -673,10 +673,10 @@
             <w:gridSpan w:val="9"/>
             <w:vAlign w:val="center"/>
             <w:tcMar>
-              <w:top w:w="30" w:type="dxa"/>
-              <w:bottom w:w="30" w:type="dxa"/>
-              <w:left w:w="45" w:type="dxa"/>
-              <w:right w:w="45" w:type="dxa"/>
+              <w:top w:w="25" w:type="dxa"/>
+              <w:bottom w:w="25" w:type="dxa"/>
+              <w:left w:w="40" w:type="dxa"/>
+              <w:right w:w="40" w:type="dxa"/>
             </w:tcMar>
             <w:shd w:fill="E8E8E8"/>
           </w:tcPr>
@@ -703,10 +703,10 @@
             <w:tcW w:type="dxa" w:w="1728"/>
             <w:vAlign w:val="center"/>
             <w:tcMar>
-              <w:top w:w="30" w:type="dxa"/>
-              <w:bottom w:w="30" w:type="dxa"/>
-              <w:left w:w="45" w:type="dxa"/>
-              <w:right w:w="45" w:type="dxa"/>
+              <w:top w:w="25" w:type="dxa"/>
+              <w:bottom w:w="25" w:type="dxa"/>
+              <w:left w:w="40" w:type="dxa"/>
+              <w:right w:w="40" w:type="dxa"/>
             </w:tcMar>
           </w:tcPr>
           <w:p>
@@ -730,10 +730,10 @@
             <w:tcW w:type="dxa" w:w="792"/>
             <w:vAlign w:val="center"/>
             <w:tcMar>
-              <w:top w:w="30" w:type="dxa"/>
-              <w:bottom w:w="30" w:type="dxa"/>
-              <w:left w:w="45" w:type="dxa"/>
-              <w:right w:w="45" w:type="dxa"/>
+              <w:top w:w="25" w:type="dxa"/>
+              <w:bottom w:w="25" w:type="dxa"/>
+              <w:left w:w="40" w:type="dxa"/>
+              <w:right w:w="40" w:type="dxa"/>
             </w:tcMar>
           </w:tcPr>
           <w:p>
@@ -757,10 +757,10 @@
             <w:tcW w:type="dxa" w:w="864"/>
             <w:vAlign w:val="center"/>
             <w:tcMar>
-              <w:top w:w="30" w:type="dxa"/>
-              <w:bottom w:w="30" w:type="dxa"/>
-              <w:left w:w="45" w:type="dxa"/>
-              <w:right w:w="45" w:type="dxa"/>
+              <w:top w:w="25" w:type="dxa"/>
+              <w:bottom w:w="25" w:type="dxa"/>
+              <w:left w:w="40" w:type="dxa"/>
+              <w:right w:w="40" w:type="dxa"/>
             </w:tcMar>
           </w:tcPr>
           <w:p>
@@ -784,10 +784,10 @@
             <w:tcW w:type="dxa" w:w="720"/>
             <w:vAlign w:val="center"/>
             <w:tcMar>
-              <w:top w:w="30" w:type="dxa"/>
-              <w:bottom w:w="30" w:type="dxa"/>
-              <w:left w:w="45" w:type="dxa"/>
-              <w:right w:w="45" w:type="dxa"/>
+              <w:top w:w="25" w:type="dxa"/>
+              <w:bottom w:w="25" w:type="dxa"/>
+              <w:left w:w="40" w:type="dxa"/>
+              <w:right w:w="40" w:type="dxa"/>
             </w:tcMar>
           </w:tcPr>
           <w:p>
@@ -811,10 +811,10 @@
             <w:tcW w:type="dxa" w:w="1368"/>
             <w:vAlign w:val="center"/>
             <w:tcMar>
-              <w:top w:w="30" w:type="dxa"/>
-              <w:bottom w:w="30" w:type="dxa"/>
-              <w:left w:w="45" w:type="dxa"/>
-              <w:right w:w="45" w:type="dxa"/>
+              <w:top w:w="25" w:type="dxa"/>
+              <w:bottom w:w="25" w:type="dxa"/>
+              <w:left w:w="40" w:type="dxa"/>
+              <w:right w:w="40" w:type="dxa"/>
             </w:tcMar>
           </w:tcPr>
           <w:p>
@@ -838,10 +838,10 @@
             <w:tcW w:type="dxa" w:w="1368"/>
             <w:vAlign w:val="center"/>
             <w:tcMar>
-              <w:top w:w="30" w:type="dxa"/>
-              <w:bottom w:w="30" w:type="dxa"/>
-              <w:left w:w="45" w:type="dxa"/>
-              <w:right w:w="45" w:type="dxa"/>
+              <w:top w:w="25" w:type="dxa"/>
+              <w:bottom w:w="25" w:type="dxa"/>
+              <w:left w:w="40" w:type="dxa"/>
+              <w:right w:w="40" w:type="dxa"/>
             </w:tcMar>
           </w:tcPr>
           <w:p>
@@ -865,10 +865,10 @@
             <w:tcW w:type="dxa" w:w="1368"/>
             <w:vAlign w:val="center"/>
             <w:tcMar>
-              <w:top w:w="30" w:type="dxa"/>
-              <w:bottom w:w="30" w:type="dxa"/>
-              <w:left w:w="45" w:type="dxa"/>
-              <w:right w:w="45" w:type="dxa"/>
+              <w:top w:w="25" w:type="dxa"/>
+              <w:bottom w:w="25" w:type="dxa"/>
+              <w:left w:w="40" w:type="dxa"/>
+              <w:right w:w="40" w:type="dxa"/>
             </w:tcMar>
           </w:tcPr>
           <w:p>
@@ -890,10 +890,10 @@
             <w:tcW w:type="dxa" w:w="1728"/>
             <w:vAlign w:val="center"/>
             <w:tcMar>
-              <w:top w:w="30" w:type="dxa"/>
-              <w:bottom w:w="30" w:type="dxa"/>
-              <w:left w:w="45" w:type="dxa"/>
-              <w:right w:w="45" w:type="dxa"/>
+              <w:top w:w="25" w:type="dxa"/>
+              <w:bottom w:w="25" w:type="dxa"/>
+              <w:left w:w="40" w:type="dxa"/>
+              <w:right w:w="40" w:type="dxa"/>
             </w:tcMar>
           </w:tcPr>
           <w:p>
@@ -917,10 +917,10 @@
             <w:tcW w:type="dxa" w:w="864"/>
             <w:vAlign w:val="center"/>
             <w:tcMar>
-              <w:top w:w="30" w:type="dxa"/>
-              <w:bottom w:w="30" w:type="dxa"/>
-              <w:left w:w="45" w:type="dxa"/>
-              <w:right w:w="45" w:type="dxa"/>
+              <w:top w:w="25" w:type="dxa"/>
+              <w:bottom w:w="25" w:type="dxa"/>
+              <w:left w:w="40" w:type="dxa"/>
+              <w:right w:w="40" w:type="dxa"/>
             </w:tcMar>
           </w:tcPr>
           <w:p>
@@ -946,10 +946,10 @@
             <w:tcW w:type="dxa" w:w="1728"/>
             <w:vAlign w:val="center"/>
             <w:tcMar>
-              <w:top w:w="30" w:type="dxa"/>
-              <w:bottom w:w="30" w:type="dxa"/>
-              <w:left w:w="45" w:type="dxa"/>
-              <w:right w:w="45" w:type="dxa"/>
+              <w:top w:w="25" w:type="dxa"/>
+              <w:bottom w:w="25" w:type="dxa"/>
+              <w:left w:w="40" w:type="dxa"/>
+              <w:right w:w="40" w:type="dxa"/>
             </w:tcMar>
           </w:tcPr>
           <w:p>
@@ -973,10 +973,10 @@
             <w:tcW w:type="dxa" w:w="792"/>
             <w:vAlign w:val="center"/>
             <w:tcMar>
-              <w:top w:w="30" w:type="dxa"/>
-              <w:bottom w:w="30" w:type="dxa"/>
-              <w:left w:w="45" w:type="dxa"/>
-              <w:right w:w="45" w:type="dxa"/>
+              <w:top w:w="25" w:type="dxa"/>
+              <w:bottom w:w="25" w:type="dxa"/>
+              <w:left w:w="40" w:type="dxa"/>
+              <w:right w:w="40" w:type="dxa"/>
             </w:tcMar>
           </w:tcPr>
           <w:p>
@@ -1000,10 +1000,10 @@
             <w:tcW w:type="dxa" w:w="864"/>
             <w:vAlign w:val="center"/>
             <w:tcMar>
-              <w:top w:w="30" w:type="dxa"/>
-              <w:bottom w:w="30" w:type="dxa"/>
-              <w:left w:w="45" w:type="dxa"/>
-              <w:right w:w="45" w:type="dxa"/>
+              <w:top w:w="25" w:type="dxa"/>
+              <w:bottom w:w="25" w:type="dxa"/>
+              <w:left w:w="40" w:type="dxa"/>
+              <w:right w:w="40" w:type="dxa"/>
             </w:tcMar>
           </w:tcPr>
           <w:p>
@@ -1027,10 +1027,10 @@
             <w:tcW w:type="dxa" w:w="720"/>
             <w:vAlign w:val="center"/>
             <w:tcMar>
-              <w:top w:w="30" w:type="dxa"/>
-              <w:bottom w:w="30" w:type="dxa"/>
-              <w:left w:w="45" w:type="dxa"/>
-              <w:right w:w="45" w:type="dxa"/>
+              <w:top w:w="25" w:type="dxa"/>
+              <w:bottom w:w="25" w:type="dxa"/>
+              <w:left w:w="40" w:type="dxa"/>
+              <w:right w:w="40" w:type="dxa"/>
             </w:tcMar>
           </w:tcPr>
           <w:p>
@@ -1054,10 +1054,10 @@
             <w:tcW w:type="dxa" w:w="1368"/>
             <w:vAlign w:val="center"/>
             <w:tcMar>
-              <w:top w:w="30" w:type="dxa"/>
-              <w:bottom w:w="30" w:type="dxa"/>
-              <w:left w:w="45" w:type="dxa"/>
-              <w:right w:w="45" w:type="dxa"/>
+              <w:top w:w="25" w:type="dxa"/>
+              <w:bottom w:w="25" w:type="dxa"/>
+              <w:left w:w="40" w:type="dxa"/>
+              <w:right w:w="40" w:type="dxa"/>
             </w:tcMar>
           </w:tcPr>
           <w:p>
@@ -1081,10 +1081,10 @@
             <w:tcW w:type="dxa" w:w="1368"/>
             <w:vAlign w:val="center"/>
             <w:tcMar>
-              <w:top w:w="30" w:type="dxa"/>
-              <w:bottom w:w="30" w:type="dxa"/>
-              <w:left w:w="45" w:type="dxa"/>
-              <w:right w:w="45" w:type="dxa"/>
+              <w:top w:w="25" w:type="dxa"/>
+              <w:bottom w:w="25" w:type="dxa"/>
+              <w:left w:w="40" w:type="dxa"/>
+              <w:right w:w="40" w:type="dxa"/>
             </w:tcMar>
           </w:tcPr>
           <w:p>
@@ -1108,10 +1108,10 @@
             <w:tcW w:type="dxa" w:w="1368"/>
             <w:vAlign w:val="center"/>
             <w:tcMar>
-              <w:top w:w="30" w:type="dxa"/>
-              <w:bottom w:w="30" w:type="dxa"/>
-              <w:left w:w="45" w:type="dxa"/>
-              <w:right w:w="45" w:type="dxa"/>
+              <w:top w:w="25" w:type="dxa"/>
+              <w:bottom w:w="25" w:type="dxa"/>
+              <w:left w:w="40" w:type="dxa"/>
+              <w:right w:w="40" w:type="dxa"/>
             </w:tcMar>
           </w:tcPr>
           <w:p>
@@ -1133,10 +1133,10 @@
             <w:tcW w:type="dxa" w:w="1728"/>
             <w:vAlign w:val="center"/>
             <w:tcMar>
-              <w:top w:w="30" w:type="dxa"/>
-              <w:bottom w:w="30" w:type="dxa"/>
-              <w:left w:w="45" w:type="dxa"/>
-              <w:right w:w="45" w:type="dxa"/>
+              <w:top w:w="25" w:type="dxa"/>
+              <w:bottom w:w="25" w:type="dxa"/>
+              <w:left w:w="40" w:type="dxa"/>
+              <w:right w:w="40" w:type="dxa"/>
             </w:tcMar>
           </w:tcPr>
           <w:p>
@@ -1160,10 +1160,10 @@
             <w:tcW w:type="dxa" w:w="864"/>
             <w:vAlign w:val="center"/>
             <w:tcMar>
-              <w:top w:w="30" w:type="dxa"/>
-              <w:bottom w:w="30" w:type="dxa"/>
-              <w:left w:w="45" w:type="dxa"/>
-              <w:right w:w="45" w:type="dxa"/>
+              <w:top w:w="25" w:type="dxa"/>
+              <w:bottom w:w="25" w:type="dxa"/>
+              <w:left w:w="40" w:type="dxa"/>
+              <w:right w:w="40" w:type="dxa"/>
             </w:tcMar>
           </w:tcPr>
           <w:p>
@@ -1189,10 +1189,10 @@
             <w:tcW w:type="dxa" w:w="1728"/>
             <w:vAlign w:val="center"/>
             <w:tcMar>
-              <w:top w:w="30" w:type="dxa"/>
-              <w:bottom w:w="30" w:type="dxa"/>
-              <w:left w:w="45" w:type="dxa"/>
-              <w:right w:w="45" w:type="dxa"/>
+              <w:top w:w="25" w:type="dxa"/>
+              <w:bottom w:w="25" w:type="dxa"/>
+              <w:left w:w="40" w:type="dxa"/>
+              <w:right w:w="40" w:type="dxa"/>
             </w:tcMar>
           </w:tcPr>
           <w:p>
@@ -1216,10 +1216,10 @@
             <w:tcW w:type="dxa" w:w="792"/>
             <w:vAlign w:val="center"/>
             <w:tcMar>
-              <w:top w:w="30" w:type="dxa"/>
-              <w:bottom w:w="30" w:type="dxa"/>
-              <w:left w:w="45" w:type="dxa"/>
-              <w:right w:w="45" w:type="dxa"/>
+              <w:top w:w="25" w:type="dxa"/>
+              <w:bottom w:w="25" w:type="dxa"/>
+              <w:left w:w="40" w:type="dxa"/>
+              <w:right w:w="40" w:type="dxa"/>
             </w:tcMar>
           </w:tcPr>
           <w:p>
@@ -1243,10 +1243,10 @@
             <w:tcW w:type="dxa" w:w="864"/>
             <w:vAlign w:val="center"/>
             <w:tcMar>
-              <w:top w:w="30" w:type="dxa"/>
-              <w:bottom w:w="30" w:type="dxa"/>
-              <w:left w:w="45" w:type="dxa"/>
-              <w:right w:w="45" w:type="dxa"/>
+              <w:top w:w="25" w:type="dxa"/>
+              <w:bottom w:w="25" w:type="dxa"/>
+              <w:left w:w="40" w:type="dxa"/>
+              <w:right w:w="40" w:type="dxa"/>
             </w:tcMar>
           </w:tcPr>
           <w:p>
@@ -1270,10 +1270,10 @@
             <w:tcW w:type="dxa" w:w="720"/>
             <w:vAlign w:val="center"/>
             <w:tcMar>
-              <w:top w:w="30" w:type="dxa"/>
-              <w:bottom w:w="30" w:type="dxa"/>
-              <w:left w:w="45" w:type="dxa"/>
-              <w:right w:w="45" w:type="dxa"/>
+              <w:top w:w="25" w:type="dxa"/>
+              <w:bottom w:w="25" w:type="dxa"/>
+              <w:left w:w="40" w:type="dxa"/>
+              <w:right w:w="40" w:type="dxa"/>
             </w:tcMar>
           </w:tcPr>
           <w:p>
@@ -1297,10 +1297,10 @@
             <w:tcW w:type="dxa" w:w="1368"/>
             <w:vAlign w:val="center"/>
             <w:tcMar>
-              <w:top w:w="30" w:type="dxa"/>
-              <w:bottom w:w="30" w:type="dxa"/>
-              <w:left w:w="45" w:type="dxa"/>
-              <w:right w:w="45" w:type="dxa"/>
+              <w:top w:w="25" w:type="dxa"/>
+              <w:bottom w:w="25" w:type="dxa"/>
+              <w:left w:w="40" w:type="dxa"/>
+              <w:right w:w="40" w:type="dxa"/>
             </w:tcMar>
           </w:tcPr>
           <w:p>
@@ -1324,10 +1324,10 @@
             <w:tcW w:type="dxa" w:w="1368"/>
             <w:vAlign w:val="center"/>
             <w:tcMar>
-              <w:top w:w="30" w:type="dxa"/>
-              <w:bottom w:w="30" w:type="dxa"/>
-              <w:left w:w="45" w:type="dxa"/>
-              <w:right w:w="45" w:type="dxa"/>
+              <w:top w:w="25" w:type="dxa"/>
+              <w:bottom w:w="25" w:type="dxa"/>
+              <w:left w:w="40" w:type="dxa"/>
+              <w:right w:w="40" w:type="dxa"/>
             </w:tcMar>
           </w:tcPr>
           <w:p>
@@ -1351,10 +1351,10 @@
             <w:tcW w:type="dxa" w:w="1368"/>
             <w:vAlign w:val="center"/>
             <w:tcMar>
-              <w:top w:w="30" w:type="dxa"/>
-              <w:bottom w:w="30" w:type="dxa"/>
-              <w:left w:w="45" w:type="dxa"/>
-              <w:right w:w="45" w:type="dxa"/>
+              <w:top w:w="25" w:type="dxa"/>
+              <w:bottom w:w="25" w:type="dxa"/>
+              <w:left w:w="40" w:type="dxa"/>
+              <w:right w:w="40" w:type="dxa"/>
             </w:tcMar>
           </w:tcPr>
           <w:p>
@@ -1376,10 +1376,10 @@
             <w:tcW w:type="dxa" w:w="1728"/>
             <w:vAlign w:val="center"/>
             <w:tcMar>
-              <w:top w:w="30" w:type="dxa"/>
-              <w:bottom w:w="30" w:type="dxa"/>
-              <w:left w:w="45" w:type="dxa"/>
-              <w:right w:w="45" w:type="dxa"/>
+              <w:top w:w="25" w:type="dxa"/>
+              <w:bottom w:w="25" w:type="dxa"/>
+              <w:left w:w="40" w:type="dxa"/>
+              <w:right w:w="40" w:type="dxa"/>
             </w:tcMar>
           </w:tcPr>
           <w:p>
@@ -1403,10 +1403,10 @@
             <w:tcW w:type="dxa" w:w="864"/>
             <w:vAlign w:val="center"/>
             <w:tcMar>
-              <w:top w:w="30" w:type="dxa"/>
-              <w:bottom w:w="30" w:type="dxa"/>
-              <w:left w:w="45" w:type="dxa"/>
-              <w:right w:w="45" w:type="dxa"/>
+              <w:top w:w="25" w:type="dxa"/>
+              <w:bottom w:w="25" w:type="dxa"/>
+              <w:left w:w="40" w:type="dxa"/>
+              <w:right w:w="40" w:type="dxa"/>
             </w:tcMar>
           </w:tcPr>
           <w:p>
@@ -1433,10 +1433,10 @@
             <w:gridSpan w:val="9"/>
             <w:vAlign w:val="center"/>
             <w:tcMar>
-              <w:top w:w="30" w:type="dxa"/>
-              <w:bottom w:w="30" w:type="dxa"/>
-              <w:left w:w="45" w:type="dxa"/>
-              <w:right w:w="45" w:type="dxa"/>
+              <w:top w:w="25" w:type="dxa"/>
+              <w:bottom w:w="25" w:type="dxa"/>
+              <w:left w:w="40" w:type="dxa"/>
+              <w:right w:w="40" w:type="dxa"/>
             </w:tcMar>
             <w:shd w:fill="E8E8E8"/>
           </w:tcPr>
@@ -1463,10 +1463,10 @@
             <w:tcW w:type="dxa" w:w="1728"/>
             <w:vAlign w:val="center"/>
             <w:tcMar>
-              <w:top w:w="30" w:type="dxa"/>
-              <w:bottom w:w="30" w:type="dxa"/>
-              <w:left w:w="45" w:type="dxa"/>
-              <w:right w:w="45" w:type="dxa"/>
+              <w:top w:w="25" w:type="dxa"/>
+              <w:bottom w:w="25" w:type="dxa"/>
+              <w:left w:w="40" w:type="dxa"/>
+              <w:right w:w="40" w:type="dxa"/>
             </w:tcMar>
           </w:tcPr>
           <w:p>
@@ -1490,10 +1490,10 @@
             <w:tcW w:type="dxa" w:w="792"/>
             <w:vAlign w:val="center"/>
             <w:tcMar>
-              <w:top w:w="30" w:type="dxa"/>
-              <w:bottom w:w="30" w:type="dxa"/>
-              <w:left w:w="45" w:type="dxa"/>
-              <w:right w:w="45" w:type="dxa"/>
+              <w:top w:w="25" w:type="dxa"/>
+              <w:bottom w:w="25" w:type="dxa"/>
+              <w:left w:w="40" w:type="dxa"/>
+              <w:right w:w="40" w:type="dxa"/>
             </w:tcMar>
           </w:tcPr>
           <w:p>
@@ -1517,10 +1517,10 @@
             <w:tcW w:type="dxa" w:w="864"/>
             <w:vAlign w:val="center"/>
             <w:tcMar>
-              <w:top w:w="30" w:type="dxa"/>
-              <w:bottom w:w="30" w:type="dxa"/>
-              <w:left w:w="45" w:type="dxa"/>
-              <w:right w:w="45" w:type="dxa"/>
+              <w:top w:w="25" w:type="dxa"/>
+              <w:bottom w:w="25" w:type="dxa"/>
+              <w:left w:w="40" w:type="dxa"/>
+              <w:right w:w="40" w:type="dxa"/>
             </w:tcMar>
           </w:tcPr>
           <w:p>
@@ -1544,10 +1544,10 @@
             <w:tcW w:type="dxa" w:w="720"/>
             <w:vAlign w:val="center"/>
             <w:tcMar>
-              <w:top w:w="30" w:type="dxa"/>
-              <w:bottom w:w="30" w:type="dxa"/>
-              <w:left w:w="45" w:type="dxa"/>
-              <w:right w:w="45" w:type="dxa"/>
+              <w:top w:w="25" w:type="dxa"/>
+              <w:bottom w:w="25" w:type="dxa"/>
+              <w:left w:w="40" w:type="dxa"/>
+              <w:right w:w="40" w:type="dxa"/>
             </w:tcMar>
           </w:tcPr>
           <w:p>
@@ -1571,10 +1571,10 @@
             <w:tcW w:type="dxa" w:w="1368"/>
             <w:vAlign w:val="center"/>
             <w:tcMar>
-              <w:top w:w="30" w:type="dxa"/>
-              <w:bottom w:w="30" w:type="dxa"/>
-              <w:left w:w="45" w:type="dxa"/>
-              <w:right w:w="45" w:type="dxa"/>
+              <w:top w:w="25" w:type="dxa"/>
+              <w:bottom w:w="25" w:type="dxa"/>
+              <w:left w:w="40" w:type="dxa"/>
+              <w:right w:w="40" w:type="dxa"/>
             </w:tcMar>
           </w:tcPr>
           <w:p>
@@ -1598,10 +1598,10 @@
             <w:tcW w:type="dxa" w:w="1368"/>
             <w:vAlign w:val="center"/>
             <w:tcMar>
-              <w:top w:w="30" w:type="dxa"/>
-              <w:bottom w:w="30" w:type="dxa"/>
-              <w:left w:w="45" w:type="dxa"/>
-              <w:right w:w="45" w:type="dxa"/>
+              <w:top w:w="25" w:type="dxa"/>
+              <w:bottom w:w="25" w:type="dxa"/>
+              <w:left w:w="40" w:type="dxa"/>
+              <w:right w:w="40" w:type="dxa"/>
             </w:tcMar>
           </w:tcPr>
           <w:p>
@@ -1625,10 +1625,10 @@
             <w:tcW w:type="dxa" w:w="1368"/>
             <w:vAlign w:val="center"/>
             <w:tcMar>
-              <w:top w:w="30" w:type="dxa"/>
-              <w:bottom w:w="30" w:type="dxa"/>
-              <w:left w:w="45" w:type="dxa"/>
-              <w:right w:w="45" w:type="dxa"/>
+              <w:top w:w="25" w:type="dxa"/>
+              <w:bottom w:w="25" w:type="dxa"/>
+              <w:left w:w="40" w:type="dxa"/>
+              <w:right w:w="40" w:type="dxa"/>
             </w:tcMar>
           </w:tcPr>
           <w:p>
@@ -1650,10 +1650,10 @@
             <w:tcW w:type="dxa" w:w="1728"/>
             <w:vAlign w:val="center"/>
             <w:tcMar>
-              <w:top w:w="30" w:type="dxa"/>
-              <w:bottom w:w="30" w:type="dxa"/>
-              <w:left w:w="45" w:type="dxa"/>
-              <w:right w:w="45" w:type="dxa"/>
+              <w:top w:w="25" w:type="dxa"/>
+              <w:bottom w:w="25" w:type="dxa"/>
+              <w:left w:w="40" w:type="dxa"/>
+              <w:right w:w="40" w:type="dxa"/>
             </w:tcMar>
           </w:tcPr>
           <w:p>
@@ -1677,10 +1677,10 @@
             <w:tcW w:type="dxa" w:w="864"/>
             <w:vAlign w:val="center"/>
             <w:tcMar>
-              <w:top w:w="30" w:type="dxa"/>
-              <w:bottom w:w="30" w:type="dxa"/>
-              <w:left w:w="45" w:type="dxa"/>
-              <w:right w:w="45" w:type="dxa"/>
+              <w:top w:w="25" w:type="dxa"/>
+              <w:bottom w:w="25" w:type="dxa"/>
+              <w:left w:w="40" w:type="dxa"/>
+              <w:right w:w="40" w:type="dxa"/>
             </w:tcMar>
           </w:tcPr>
           <w:p>
@@ -1706,10 +1706,10 @@
             <w:tcW w:type="dxa" w:w="1728"/>
             <w:vAlign w:val="center"/>
             <w:tcMar>
-              <w:top w:w="30" w:type="dxa"/>
-              <w:bottom w:w="30" w:type="dxa"/>
-              <w:left w:w="45" w:type="dxa"/>
-              <w:right w:w="45" w:type="dxa"/>
+              <w:top w:w="25" w:type="dxa"/>
+              <w:bottom w:w="25" w:type="dxa"/>
+              <w:left w:w="40" w:type="dxa"/>
+              <w:right w:w="40" w:type="dxa"/>
             </w:tcMar>
           </w:tcPr>
           <w:p>
@@ -1733,10 +1733,10 @@
             <w:tcW w:type="dxa" w:w="792"/>
             <w:vAlign w:val="center"/>
             <w:tcMar>
-              <w:top w:w="30" w:type="dxa"/>
-              <w:bottom w:w="30" w:type="dxa"/>
-              <w:left w:w="45" w:type="dxa"/>
-              <w:right w:w="45" w:type="dxa"/>
+              <w:top w:w="25" w:type="dxa"/>
+              <w:bottom w:w="25" w:type="dxa"/>
+              <w:left w:w="40" w:type="dxa"/>
+              <w:right w:w="40" w:type="dxa"/>
             </w:tcMar>
           </w:tcPr>
           <w:p>
@@ -1760,10 +1760,10 @@
             <w:tcW w:type="dxa" w:w="864"/>
             <w:vAlign w:val="center"/>
             <w:tcMar>
-              <w:top w:w="30" w:type="dxa"/>
-              <w:bottom w:w="30" w:type="dxa"/>
-              <w:left w:w="45" w:type="dxa"/>
-              <w:right w:w="45" w:type="dxa"/>
+              <w:top w:w="25" w:type="dxa"/>
+              <w:bottom w:w="25" w:type="dxa"/>
+              <w:left w:w="40" w:type="dxa"/>
+              <w:right w:w="40" w:type="dxa"/>
             </w:tcMar>
           </w:tcPr>
           <w:p>
@@ -1787,10 +1787,10 @@
             <w:tcW w:type="dxa" w:w="720"/>
             <w:vAlign w:val="center"/>
             <w:tcMar>
-              <w:top w:w="30" w:type="dxa"/>
-              <w:bottom w:w="30" w:type="dxa"/>
-              <w:left w:w="45" w:type="dxa"/>
-              <w:right w:w="45" w:type="dxa"/>
+              <w:top w:w="25" w:type="dxa"/>
+              <w:bottom w:w="25" w:type="dxa"/>
+              <w:left w:w="40" w:type="dxa"/>
+              <w:right w:w="40" w:type="dxa"/>
             </w:tcMar>
           </w:tcPr>
           <w:p>
@@ -1814,10 +1814,10 @@
             <w:tcW w:type="dxa" w:w="1368"/>
             <w:vAlign w:val="center"/>
             <w:tcMar>
-              <w:top w:w="30" w:type="dxa"/>
-              <w:bottom w:w="30" w:type="dxa"/>
-              <w:left w:w="45" w:type="dxa"/>
-              <w:right w:w="45" w:type="dxa"/>
+              <w:top w:w="25" w:type="dxa"/>
+              <w:bottom w:w="25" w:type="dxa"/>
+              <w:left w:w="40" w:type="dxa"/>
+              <w:right w:w="40" w:type="dxa"/>
             </w:tcMar>
           </w:tcPr>
           <w:p>
@@ -1841,10 +1841,10 @@
             <w:tcW w:type="dxa" w:w="1368"/>
             <w:vAlign w:val="center"/>
             <w:tcMar>
-              <w:top w:w="30" w:type="dxa"/>
-              <w:bottom w:w="30" w:type="dxa"/>
-              <w:left w:w="45" w:type="dxa"/>
-              <w:right w:w="45" w:type="dxa"/>
+              <w:top w:w="25" w:type="dxa"/>
+              <w:bottom w:w="25" w:type="dxa"/>
+              <w:left w:w="40" w:type="dxa"/>
+              <w:right w:w="40" w:type="dxa"/>
             </w:tcMar>
           </w:tcPr>
           <w:p>
@@ -1868,10 +1868,10 @@
             <w:tcW w:type="dxa" w:w="1368"/>
             <w:vAlign w:val="center"/>
             <w:tcMar>
-              <w:top w:w="30" w:type="dxa"/>
-              <w:bottom w:w="30" w:type="dxa"/>
-              <w:left w:w="45" w:type="dxa"/>
-              <w:right w:w="45" w:type="dxa"/>
+              <w:top w:w="25" w:type="dxa"/>
+              <w:bottom w:w="25" w:type="dxa"/>
+              <w:left w:w="40" w:type="dxa"/>
+              <w:right w:w="40" w:type="dxa"/>
             </w:tcMar>
           </w:tcPr>
           <w:p>
@@ -1893,10 +1893,10 @@
             <w:tcW w:type="dxa" w:w="1728"/>
             <w:vAlign w:val="center"/>
             <w:tcMar>
-              <w:top w:w="30" w:type="dxa"/>
-              <w:bottom w:w="30" w:type="dxa"/>
-              <w:left w:w="45" w:type="dxa"/>
-              <w:right w:w="45" w:type="dxa"/>
+              <w:top w:w="25" w:type="dxa"/>
+              <w:bottom w:w="25" w:type="dxa"/>
+              <w:left w:w="40" w:type="dxa"/>
+              <w:right w:w="40" w:type="dxa"/>
             </w:tcMar>
           </w:tcPr>
           <w:p>
@@ -1920,10 +1920,10 @@
             <w:tcW w:type="dxa" w:w="864"/>
             <w:vAlign w:val="center"/>
             <w:tcMar>
-              <w:top w:w="30" w:type="dxa"/>
-              <w:bottom w:w="30" w:type="dxa"/>
-              <w:left w:w="45" w:type="dxa"/>
-              <w:right w:w="45" w:type="dxa"/>
+              <w:top w:w="25" w:type="dxa"/>
+              <w:bottom w:w="25" w:type="dxa"/>
+              <w:left w:w="40" w:type="dxa"/>
+              <w:right w:w="40" w:type="dxa"/>
             </w:tcMar>
           </w:tcPr>
           <w:p>
@@ -1949,10 +1949,10 @@
             <w:tcW w:type="dxa" w:w="1728"/>
             <w:vAlign w:val="center"/>
             <w:tcMar>
-              <w:top w:w="30" w:type="dxa"/>
-              <w:bottom w:w="30" w:type="dxa"/>
-              <w:left w:w="45" w:type="dxa"/>
-              <w:right w:w="45" w:type="dxa"/>
+              <w:top w:w="25" w:type="dxa"/>
+              <w:bottom w:w="25" w:type="dxa"/>
+              <w:left w:w="40" w:type="dxa"/>
+              <w:right w:w="40" w:type="dxa"/>
             </w:tcMar>
           </w:tcPr>
           <w:p>
@@ -1976,10 +1976,10 @@
             <w:tcW w:type="dxa" w:w="792"/>
             <w:vAlign w:val="center"/>
             <w:tcMar>
-              <w:top w:w="30" w:type="dxa"/>
-              <w:bottom w:w="30" w:type="dxa"/>
-              <w:left w:w="45" w:type="dxa"/>
-              <w:right w:w="45" w:type="dxa"/>
+              <w:top w:w="25" w:type="dxa"/>
+              <w:bottom w:w="25" w:type="dxa"/>
+              <w:left w:w="40" w:type="dxa"/>
+              <w:right w:w="40" w:type="dxa"/>
             </w:tcMar>
           </w:tcPr>
           <w:p>
@@ -2003,10 +2003,10 @@
             <w:tcW w:type="dxa" w:w="864"/>
             <w:vAlign w:val="center"/>
             <w:tcMar>
-              <w:top w:w="30" w:type="dxa"/>
-              <w:bottom w:w="30" w:type="dxa"/>
-              <w:left w:w="45" w:type="dxa"/>
-              <w:right w:w="45" w:type="dxa"/>
+              <w:top w:w="25" w:type="dxa"/>
+              <w:bottom w:w="25" w:type="dxa"/>
+              <w:left w:w="40" w:type="dxa"/>
+              <w:right w:w="40" w:type="dxa"/>
             </w:tcMar>
           </w:tcPr>
           <w:p>
@@ -2030,10 +2030,10 @@
             <w:tcW w:type="dxa" w:w="720"/>
             <w:vAlign w:val="center"/>
             <w:tcMar>
-              <w:top w:w="30" w:type="dxa"/>
-              <w:bottom w:w="30" w:type="dxa"/>
-              <w:left w:w="45" w:type="dxa"/>
-              <w:right w:w="45" w:type="dxa"/>
+              <w:top w:w="25" w:type="dxa"/>
+              <w:bottom w:w="25" w:type="dxa"/>
+              <w:left w:w="40" w:type="dxa"/>
+              <w:right w:w="40" w:type="dxa"/>
             </w:tcMar>
           </w:tcPr>
           <w:p>
@@ -2057,10 +2057,10 @@
             <w:tcW w:type="dxa" w:w="1368"/>
             <w:vAlign w:val="center"/>
             <w:tcMar>
-              <w:top w:w="30" w:type="dxa"/>
-              <w:bottom w:w="30" w:type="dxa"/>
-              <w:left w:w="45" w:type="dxa"/>
-              <w:right w:w="45" w:type="dxa"/>
+              <w:top w:w="25" w:type="dxa"/>
+              <w:bottom w:w="25" w:type="dxa"/>
+              <w:left w:w="40" w:type="dxa"/>
+              <w:right w:w="40" w:type="dxa"/>
             </w:tcMar>
           </w:tcPr>
           <w:p>
@@ -2084,10 +2084,10 @@
             <w:tcW w:type="dxa" w:w="1368"/>
             <w:vAlign w:val="center"/>
             <w:tcMar>
-              <w:top w:w="30" w:type="dxa"/>
-              <w:bottom w:w="30" w:type="dxa"/>
-              <w:left w:w="45" w:type="dxa"/>
-              <w:right w:w="45" w:type="dxa"/>
+              <w:top w:w="25" w:type="dxa"/>
+              <w:bottom w:w="25" w:type="dxa"/>
+              <w:left w:w="40" w:type="dxa"/>
+              <w:right w:w="40" w:type="dxa"/>
             </w:tcMar>
           </w:tcPr>
           <w:p>
@@ -2111,10 +2111,10 @@
             <w:tcW w:type="dxa" w:w="1368"/>
             <w:vAlign w:val="center"/>
             <w:tcMar>
-              <w:top w:w="30" w:type="dxa"/>
-              <w:bottom w:w="30" w:type="dxa"/>
-              <w:left w:w="45" w:type="dxa"/>
-              <w:right w:w="45" w:type="dxa"/>
+              <w:top w:w="25" w:type="dxa"/>
+              <w:bottom w:w="25" w:type="dxa"/>
+              <w:left w:w="40" w:type="dxa"/>
+              <w:right w:w="40" w:type="dxa"/>
             </w:tcMar>
           </w:tcPr>
           <w:p>
@@ -2136,10 +2136,10 @@
             <w:tcW w:type="dxa" w:w="1728"/>
             <w:vAlign w:val="center"/>
             <w:tcMar>
-              <w:top w:w="30" w:type="dxa"/>
-              <w:bottom w:w="30" w:type="dxa"/>
-              <w:left w:w="45" w:type="dxa"/>
-              <w:right w:w="45" w:type="dxa"/>
+              <w:top w:w="25" w:type="dxa"/>
+              <w:bottom w:w="25" w:type="dxa"/>
+              <w:left w:w="40" w:type="dxa"/>
+              <w:right w:w="40" w:type="dxa"/>
             </w:tcMar>
           </w:tcPr>
           <w:p>
@@ -2163,10 +2163,10 @@
             <w:tcW w:type="dxa" w:w="864"/>
             <w:vAlign w:val="center"/>
             <w:tcMar>
-              <w:top w:w="30" w:type="dxa"/>
-              <w:bottom w:w="30" w:type="dxa"/>
-              <w:left w:w="45" w:type="dxa"/>
-              <w:right w:w="45" w:type="dxa"/>
+              <w:top w:w="25" w:type="dxa"/>
+              <w:bottom w:w="25" w:type="dxa"/>
+              <w:left w:w="40" w:type="dxa"/>
+              <w:right w:w="40" w:type="dxa"/>
             </w:tcMar>
           </w:tcPr>
           <w:p>
@@ -2192,10 +2192,10 @@
             <w:tcW w:type="dxa" w:w="1728"/>
             <w:vAlign w:val="center"/>
             <w:tcMar>
-              <w:top w:w="30" w:type="dxa"/>
-              <w:bottom w:w="30" w:type="dxa"/>
-              <w:left w:w="45" w:type="dxa"/>
-              <w:right w:w="45" w:type="dxa"/>
+              <w:top w:w="25" w:type="dxa"/>
+              <w:bottom w:w="25" w:type="dxa"/>
+              <w:left w:w="40" w:type="dxa"/>
+              <w:right w:w="40" w:type="dxa"/>
             </w:tcMar>
           </w:tcPr>
           <w:p>
@@ -2219,10 +2219,10 @@
             <w:tcW w:type="dxa" w:w="792"/>
             <w:vAlign w:val="center"/>
             <w:tcMar>
-              <w:top w:w="30" w:type="dxa"/>
-              <w:bottom w:w="30" w:type="dxa"/>
-              <w:left w:w="45" w:type="dxa"/>
-              <w:right w:w="45" w:type="dxa"/>
+              <w:top w:w="25" w:type="dxa"/>
+              <w:bottom w:w="25" w:type="dxa"/>
+              <w:left w:w="40" w:type="dxa"/>
+              <w:right w:w="40" w:type="dxa"/>
             </w:tcMar>
           </w:tcPr>
           <w:p>
@@ -2246,10 +2246,10 @@
             <w:tcW w:type="dxa" w:w="864"/>
             <w:vAlign w:val="center"/>
             <w:tcMar>
-              <w:top w:w="30" w:type="dxa"/>
-              <w:bottom w:w="30" w:type="dxa"/>
-              <w:left w:w="45" w:type="dxa"/>
-              <w:right w:w="45" w:type="dxa"/>
+              <w:top w:w="25" w:type="dxa"/>
+              <w:bottom w:w="25" w:type="dxa"/>
+              <w:left w:w="40" w:type="dxa"/>
+              <w:right w:w="40" w:type="dxa"/>
             </w:tcMar>
           </w:tcPr>
           <w:p>
@@ -2273,10 +2273,10 @@
             <w:tcW w:type="dxa" w:w="720"/>
             <w:vAlign w:val="center"/>
             <w:tcMar>
-              <w:top w:w="30" w:type="dxa"/>
-              <w:bottom w:w="30" w:type="dxa"/>
-              <w:left w:w="45" w:type="dxa"/>
-              <w:right w:w="45" w:type="dxa"/>
+              <w:top w:w="25" w:type="dxa"/>
+              <w:bottom w:w="25" w:type="dxa"/>
+              <w:left w:w="40" w:type="dxa"/>
+              <w:right w:w="40" w:type="dxa"/>
             </w:tcMar>
           </w:tcPr>
           <w:p>
@@ -2300,10 +2300,10 @@
             <w:tcW w:type="dxa" w:w="1368"/>
             <w:vAlign w:val="center"/>
             <w:tcMar>
-              <w:top w:w="30" w:type="dxa"/>
-              <w:bottom w:w="30" w:type="dxa"/>
-              <w:left w:w="45" w:type="dxa"/>
-              <w:right w:w="45" w:type="dxa"/>
+              <w:top w:w="25" w:type="dxa"/>
+              <w:bottom w:w="25" w:type="dxa"/>
+              <w:left w:w="40" w:type="dxa"/>
+              <w:right w:w="40" w:type="dxa"/>
             </w:tcMar>
           </w:tcPr>
           <w:p>
@@ -2327,10 +2327,10 @@
             <w:tcW w:type="dxa" w:w="1368"/>
             <w:vAlign w:val="center"/>
             <w:tcMar>
-              <w:top w:w="30" w:type="dxa"/>
-              <w:bottom w:w="30" w:type="dxa"/>
-              <w:left w:w="45" w:type="dxa"/>
-              <w:right w:w="45" w:type="dxa"/>
+              <w:top w:w="25" w:type="dxa"/>
+              <w:bottom w:w="25" w:type="dxa"/>
+              <w:left w:w="40" w:type="dxa"/>
+              <w:right w:w="40" w:type="dxa"/>
             </w:tcMar>
           </w:tcPr>
           <w:p>
@@ -2354,10 +2354,10 @@
             <w:tcW w:type="dxa" w:w="1368"/>
             <w:vAlign w:val="center"/>
             <w:tcMar>
-              <w:top w:w="30" w:type="dxa"/>
-              <w:bottom w:w="30" w:type="dxa"/>
-              <w:left w:w="45" w:type="dxa"/>
-              <w:right w:w="45" w:type="dxa"/>
+              <w:top w:w="25" w:type="dxa"/>
+              <w:bottom w:w="25" w:type="dxa"/>
+              <w:left w:w="40" w:type="dxa"/>
+              <w:right w:w="40" w:type="dxa"/>
             </w:tcMar>
           </w:tcPr>
           <w:p>
@@ -2379,10 +2379,10 @@
             <w:tcW w:type="dxa" w:w="1728"/>
             <w:vAlign w:val="center"/>
             <w:tcMar>
-              <w:top w:w="30" w:type="dxa"/>
-              <w:bottom w:w="30" w:type="dxa"/>
-              <w:left w:w="45" w:type="dxa"/>
-              <w:right w:w="45" w:type="dxa"/>
+              <w:top w:w="25" w:type="dxa"/>
+              <w:bottom w:w="25" w:type="dxa"/>
+              <w:left w:w="40" w:type="dxa"/>
+              <w:right w:w="40" w:type="dxa"/>
             </w:tcMar>
           </w:tcPr>
           <w:p>
@@ -2406,10 +2406,10 @@
             <w:tcW w:type="dxa" w:w="864"/>
             <w:vAlign w:val="center"/>
             <w:tcMar>
-              <w:top w:w="30" w:type="dxa"/>
-              <w:bottom w:w="30" w:type="dxa"/>
-              <w:left w:w="45" w:type="dxa"/>
-              <w:right w:w="45" w:type="dxa"/>
+              <w:top w:w="25" w:type="dxa"/>
+              <w:bottom w:w="25" w:type="dxa"/>
+              <w:left w:w="40" w:type="dxa"/>
+              <w:right w:w="40" w:type="dxa"/>
             </w:tcMar>
           </w:tcPr>
           <w:p>
@@ -2435,10 +2435,10 @@
             <w:tcW w:type="dxa" w:w="1728"/>
             <w:vAlign w:val="center"/>
             <w:tcMar>
-              <w:top w:w="30" w:type="dxa"/>
-              <w:bottom w:w="30" w:type="dxa"/>
-              <w:left w:w="45" w:type="dxa"/>
-              <w:right w:w="45" w:type="dxa"/>
+              <w:top w:w="25" w:type="dxa"/>
+              <w:bottom w:w="25" w:type="dxa"/>
+              <w:left w:w="40" w:type="dxa"/>
+              <w:right w:w="40" w:type="dxa"/>
             </w:tcMar>
           </w:tcPr>
           <w:p>
@@ -2462,10 +2462,10 @@
             <w:tcW w:type="dxa" w:w="792"/>
             <w:vAlign w:val="center"/>
             <w:tcMar>
-              <w:top w:w="30" w:type="dxa"/>
-              <w:bottom w:w="30" w:type="dxa"/>
-              <w:left w:w="45" w:type="dxa"/>
-              <w:right w:w="45" w:type="dxa"/>
+              <w:top w:w="25" w:type="dxa"/>
+              <w:bottom w:w="25" w:type="dxa"/>
+              <w:left w:w="40" w:type="dxa"/>
+              <w:right w:w="40" w:type="dxa"/>
             </w:tcMar>
           </w:tcPr>
           <w:p>
@@ -2489,10 +2489,10 @@
             <w:tcW w:type="dxa" w:w="864"/>
             <w:vAlign w:val="center"/>
             <w:tcMar>
-              <w:top w:w="30" w:type="dxa"/>
-              <w:bottom w:w="30" w:type="dxa"/>
-              <w:left w:w="45" w:type="dxa"/>
-              <w:right w:w="45" w:type="dxa"/>
+              <w:top w:w="25" w:type="dxa"/>
+              <w:bottom w:w="25" w:type="dxa"/>
+              <w:left w:w="40" w:type="dxa"/>
+              <w:right w:w="40" w:type="dxa"/>
             </w:tcMar>
           </w:tcPr>
           <w:p>
@@ -2516,10 +2516,10 @@
             <w:tcW w:type="dxa" w:w="720"/>
             <w:vAlign w:val="center"/>
             <w:tcMar>
-              <w:top w:w="30" w:type="dxa"/>
-              <w:bottom w:w="30" w:type="dxa"/>
-              <w:left w:w="45" w:type="dxa"/>
-              <w:right w:w="45" w:type="dxa"/>
+              <w:top w:w="25" w:type="dxa"/>
+              <w:bottom w:w="25" w:type="dxa"/>
+              <w:left w:w="40" w:type="dxa"/>
+              <w:right w:w="40" w:type="dxa"/>
             </w:tcMar>
           </w:tcPr>
           <w:p>
@@ -2543,10 +2543,10 @@
             <w:tcW w:type="dxa" w:w="1368"/>
             <w:vAlign w:val="center"/>
             <w:tcMar>
-              <w:top w:w="30" w:type="dxa"/>
-              <w:bottom w:w="30" w:type="dxa"/>
-              <w:left w:w="45" w:type="dxa"/>
-              <w:right w:w="45" w:type="dxa"/>
+              <w:top w:w="25" w:type="dxa"/>
+              <w:bottom w:w="25" w:type="dxa"/>
+              <w:left w:w="40" w:type="dxa"/>
+              <w:right w:w="40" w:type="dxa"/>
             </w:tcMar>
           </w:tcPr>
           <w:p>
@@ -2570,10 +2570,10 @@
             <w:tcW w:type="dxa" w:w="1368"/>
             <w:vAlign w:val="center"/>
             <w:tcMar>
-              <w:top w:w="30" w:type="dxa"/>
-              <w:bottom w:w="30" w:type="dxa"/>
-              <w:left w:w="45" w:type="dxa"/>
-              <w:right w:w="45" w:type="dxa"/>
+              <w:top w:w="25" w:type="dxa"/>
+              <w:bottom w:w="25" w:type="dxa"/>
+              <w:left w:w="40" w:type="dxa"/>
+              <w:right w:w="40" w:type="dxa"/>
             </w:tcMar>
           </w:tcPr>
           <w:p>
@@ -2597,10 +2597,10 @@
             <w:tcW w:type="dxa" w:w="1368"/>
             <w:vAlign w:val="center"/>
             <w:tcMar>
-              <w:top w:w="30" w:type="dxa"/>
-              <w:bottom w:w="30" w:type="dxa"/>
-              <w:left w:w="45" w:type="dxa"/>
-              <w:right w:w="45" w:type="dxa"/>
+              <w:top w:w="25" w:type="dxa"/>
+              <w:bottom w:w="25" w:type="dxa"/>
+              <w:left w:w="40" w:type="dxa"/>
+              <w:right w:w="40" w:type="dxa"/>
             </w:tcMar>
           </w:tcPr>
           <w:p>
@@ -2622,10 +2622,10 @@
             <w:tcW w:type="dxa" w:w="1728"/>
             <w:vAlign w:val="center"/>
             <w:tcMar>
-              <w:top w:w="30" w:type="dxa"/>
-              <w:bottom w:w="30" w:type="dxa"/>
-              <w:left w:w="45" w:type="dxa"/>
-              <w:right w:w="45" w:type="dxa"/>
+              <w:top w:w="25" w:type="dxa"/>
+              <w:bottom w:w="25" w:type="dxa"/>
+              <w:left w:w="40" w:type="dxa"/>
+              <w:right w:w="40" w:type="dxa"/>
             </w:tcMar>
           </w:tcPr>
           <w:p>
@@ -2649,10 +2649,10 @@
             <w:tcW w:type="dxa" w:w="864"/>
             <w:vAlign w:val="center"/>
             <w:tcMar>
-              <w:top w:w="30" w:type="dxa"/>
-              <w:bottom w:w="30" w:type="dxa"/>
-              <w:left w:w="45" w:type="dxa"/>
-              <w:right w:w="45" w:type="dxa"/>
+              <w:top w:w="25" w:type="dxa"/>
+              <w:bottom w:w="25" w:type="dxa"/>
+              <w:left w:w="40" w:type="dxa"/>
+              <w:right w:w="40" w:type="dxa"/>
             </w:tcMar>
           </w:tcPr>
           <w:p>
@@ -2678,10 +2678,10 @@
             <w:tcW w:type="dxa" w:w="1728"/>
             <w:vAlign w:val="center"/>
             <w:tcMar>
-              <w:top w:w="30" w:type="dxa"/>
-              <w:bottom w:w="30" w:type="dxa"/>
-              <w:left w:w="45" w:type="dxa"/>
-              <w:right w:w="45" w:type="dxa"/>
+              <w:top w:w="25" w:type="dxa"/>
+              <w:bottom w:w="25" w:type="dxa"/>
+              <w:left w:w="40" w:type="dxa"/>
+              <w:right w:w="40" w:type="dxa"/>
             </w:tcMar>
           </w:tcPr>
           <w:p>
@@ -2705,10 +2705,10 @@
             <w:tcW w:type="dxa" w:w="792"/>
             <w:vAlign w:val="center"/>
             <w:tcMar>
-              <w:top w:w="30" w:type="dxa"/>
-              <w:bottom w:w="30" w:type="dxa"/>
-              <w:left w:w="45" w:type="dxa"/>
-              <w:right w:w="45" w:type="dxa"/>
+              <w:top w:w="25" w:type="dxa"/>
+              <w:bottom w:w="25" w:type="dxa"/>
+              <w:left w:w="40" w:type="dxa"/>
+              <w:right w:w="40" w:type="dxa"/>
             </w:tcMar>
           </w:tcPr>
           <w:p>
@@ -2732,10 +2732,10 @@
             <w:tcW w:type="dxa" w:w="864"/>
             <w:vAlign w:val="center"/>
             <w:tcMar>
-              <w:top w:w="30" w:type="dxa"/>
-              <w:bottom w:w="30" w:type="dxa"/>
-              <w:left w:w="45" w:type="dxa"/>
-              <w:right w:w="45" w:type="dxa"/>
+              <w:top w:w="25" w:type="dxa"/>
+              <w:bottom w:w="25" w:type="dxa"/>
+              <w:left w:w="40" w:type="dxa"/>
+              <w:right w:w="40" w:type="dxa"/>
             </w:tcMar>
           </w:tcPr>
           <w:p>
@@ -2759,10 +2759,10 @@
             <w:tcW w:type="dxa" w:w="720"/>
             <w:vAlign w:val="center"/>
             <w:tcMar>
-              <w:top w:w="30" w:type="dxa"/>
-              <w:bottom w:w="30" w:type="dxa"/>
-              <w:left w:w="45" w:type="dxa"/>
-              <w:right w:w="45" w:type="dxa"/>
+              <w:top w:w="25" w:type="dxa"/>
+              <w:bottom w:w="25" w:type="dxa"/>
+              <w:left w:w="40" w:type="dxa"/>
+              <w:right w:w="40" w:type="dxa"/>
             </w:tcMar>
           </w:tcPr>
           <w:p>
@@ -2786,10 +2786,10 @@
             <w:tcW w:type="dxa" w:w="1368"/>
             <w:vAlign w:val="center"/>
             <w:tcMar>
-              <w:top w:w="30" w:type="dxa"/>
-              <w:bottom w:w="30" w:type="dxa"/>
-              <w:left w:w="45" w:type="dxa"/>
-              <w:right w:w="45" w:type="dxa"/>
+              <w:top w:w="25" w:type="dxa"/>
+              <w:bottom w:w="25" w:type="dxa"/>
+              <w:left w:w="40" w:type="dxa"/>
+              <w:right w:w="40" w:type="dxa"/>
             </w:tcMar>
           </w:tcPr>
           <w:p>
@@ -2813,10 +2813,10 @@
             <w:tcW w:type="dxa" w:w="1368"/>
             <w:vAlign w:val="center"/>
             <w:tcMar>
-              <w:top w:w="30" w:type="dxa"/>
-              <w:bottom w:w="30" w:type="dxa"/>
-              <w:left w:w="45" w:type="dxa"/>
-              <w:right w:w="45" w:type="dxa"/>
+              <w:top w:w="25" w:type="dxa"/>
+              <w:bottom w:w="25" w:type="dxa"/>
+              <w:left w:w="40" w:type="dxa"/>
+              <w:right w:w="40" w:type="dxa"/>
             </w:tcMar>
           </w:tcPr>
           <w:p>
@@ -2840,10 +2840,10 @@
             <w:tcW w:type="dxa" w:w="1368"/>
             <w:vAlign w:val="center"/>
             <w:tcMar>
-              <w:top w:w="30" w:type="dxa"/>
-              <w:bottom w:w="30" w:type="dxa"/>
-              <w:left w:w="45" w:type="dxa"/>
-              <w:right w:w="45" w:type="dxa"/>
+              <w:top w:w="25" w:type="dxa"/>
+              <w:bottom w:w="25" w:type="dxa"/>
+              <w:left w:w="40" w:type="dxa"/>
+              <w:right w:w="40" w:type="dxa"/>
             </w:tcMar>
           </w:tcPr>
           <w:p>
@@ -2865,10 +2865,10 @@
             <w:tcW w:type="dxa" w:w="1728"/>
             <w:vAlign w:val="center"/>
             <w:tcMar>
-              <w:top w:w="30" w:type="dxa"/>
-              <w:bottom w:w="30" w:type="dxa"/>
-              <w:left w:w="45" w:type="dxa"/>
-              <w:right w:w="45" w:type="dxa"/>
+              <w:top w:w="25" w:type="dxa"/>
+              <w:bottom w:w="25" w:type="dxa"/>
+              <w:left w:w="40" w:type="dxa"/>
+              <w:right w:w="40" w:type="dxa"/>
             </w:tcMar>
           </w:tcPr>
           <w:p>
@@ -2892,10 +2892,10 @@
             <w:tcW w:type="dxa" w:w="864"/>
             <w:vAlign w:val="center"/>
             <w:tcMar>
-              <w:top w:w="30" w:type="dxa"/>
-              <w:bottom w:w="30" w:type="dxa"/>
-              <w:left w:w="45" w:type="dxa"/>
-              <w:right w:w="45" w:type="dxa"/>
+              <w:top w:w="25" w:type="dxa"/>
+              <w:bottom w:w="25" w:type="dxa"/>
+              <w:left w:w="40" w:type="dxa"/>
+              <w:right w:w="40" w:type="dxa"/>
             </w:tcMar>
           </w:tcPr>
           <w:p>
@@ -2922,10 +2922,10 @@
             <w:gridSpan w:val="9"/>
             <w:vAlign w:val="center"/>
             <w:tcMar>
-              <w:top w:w="30" w:type="dxa"/>
-              <w:bottom w:w="30" w:type="dxa"/>
-              <w:left w:w="45" w:type="dxa"/>
-              <w:right w:w="45" w:type="dxa"/>
+              <w:top w:w="25" w:type="dxa"/>
+              <w:bottom w:w="25" w:type="dxa"/>
+              <w:left w:w="40" w:type="dxa"/>
+              <w:right w:w="40" w:type="dxa"/>
             </w:tcMar>
             <w:shd w:fill="E8E8E8"/>
           </w:tcPr>
@@ -2952,10 +2952,10 @@
             <w:tcW w:type="dxa" w:w="1728"/>
             <w:vAlign w:val="center"/>
             <w:tcMar>
-              <w:top w:w="30" w:type="dxa"/>
-              <w:bottom w:w="30" w:type="dxa"/>
-              <w:left w:w="45" w:type="dxa"/>
-              <w:right w:w="45" w:type="dxa"/>
+              <w:top w:w="25" w:type="dxa"/>
+              <w:bottom w:w="25" w:type="dxa"/>
+              <w:left w:w="40" w:type="dxa"/>
+              <w:right w:w="40" w:type="dxa"/>
             </w:tcMar>
           </w:tcPr>
           <w:p>
@@ -2979,10 +2979,10 @@
             <w:tcW w:type="dxa" w:w="792"/>
             <w:vAlign w:val="center"/>
             <w:tcMar>
-              <w:top w:w="30" w:type="dxa"/>
-              <w:bottom w:w="30" w:type="dxa"/>
-              <w:left w:w="45" w:type="dxa"/>
-              <w:right w:w="45" w:type="dxa"/>
+              <w:top w:w="25" w:type="dxa"/>
+              <w:bottom w:w="25" w:type="dxa"/>
+              <w:left w:w="40" w:type="dxa"/>
+              <w:right w:w="40" w:type="dxa"/>
             </w:tcMar>
           </w:tcPr>
           <w:p>
@@ -3006,10 +3006,10 @@
             <w:tcW w:type="dxa" w:w="864"/>
             <w:vAlign w:val="center"/>
             <w:tcMar>
-              <w:top w:w="30" w:type="dxa"/>
-              <w:bottom w:w="30" w:type="dxa"/>
-              <w:left w:w="45" w:type="dxa"/>
-              <w:right w:w="45" w:type="dxa"/>
+              <w:top w:w="25" w:type="dxa"/>
+              <w:bottom w:w="25" w:type="dxa"/>
+              <w:left w:w="40" w:type="dxa"/>
+              <w:right w:w="40" w:type="dxa"/>
             </w:tcMar>
           </w:tcPr>
           <w:p>
@@ -3033,10 +3033,10 @@
             <w:tcW w:type="dxa" w:w="720"/>
             <w:vAlign w:val="center"/>
             <w:tcMar>
-              <w:top w:w="30" w:type="dxa"/>
-              <w:bottom w:w="30" w:type="dxa"/>
-              <w:left w:w="45" w:type="dxa"/>
-              <w:right w:w="45" w:type="dxa"/>
+              <w:top w:w="25" w:type="dxa"/>
+              <w:bottom w:w="25" w:type="dxa"/>
+              <w:left w:w="40" w:type="dxa"/>
+              <w:right w:w="40" w:type="dxa"/>
             </w:tcMar>
           </w:tcPr>
           <w:p>
@@ -3060,10 +3060,10 @@
             <w:tcW w:type="dxa" w:w="1368"/>
             <w:vAlign w:val="center"/>
             <w:tcMar>
-              <w:top w:w="30" w:type="dxa"/>
-              <w:bottom w:w="30" w:type="dxa"/>
-              <w:left w:w="45" w:type="dxa"/>
-              <w:right w:w="45" w:type="dxa"/>
+              <w:top w:w="25" w:type="dxa"/>
+              <w:bottom w:w="25" w:type="dxa"/>
+              <w:left w:w="40" w:type="dxa"/>
+              <w:right w:w="40" w:type="dxa"/>
             </w:tcMar>
           </w:tcPr>
           <w:p>
@@ -3087,10 +3087,10 @@
             <w:tcW w:type="dxa" w:w="1368"/>
             <w:vAlign w:val="center"/>
             <w:tcMar>
-              <w:top w:w="30" w:type="dxa"/>
-              <w:bottom w:w="30" w:type="dxa"/>
-              <w:left w:w="45" w:type="dxa"/>
-              <w:right w:w="45" w:type="dxa"/>
+              <w:top w:w="25" w:type="dxa"/>
+              <w:bottom w:w="25" w:type="dxa"/>
+              <w:left w:w="40" w:type="dxa"/>
+              <w:right w:w="40" w:type="dxa"/>
             </w:tcMar>
           </w:tcPr>
           <w:p>
@@ -3114,10 +3114,10 @@
             <w:tcW w:type="dxa" w:w="1368"/>
             <w:vAlign w:val="center"/>
             <w:tcMar>
-              <w:top w:w="30" w:type="dxa"/>
-              <w:bottom w:w="30" w:type="dxa"/>
-              <w:left w:w="45" w:type="dxa"/>
-              <w:right w:w="45" w:type="dxa"/>
+              <w:top w:w="25" w:type="dxa"/>
+              <w:bottom w:w="25" w:type="dxa"/>
+              <w:left w:w="40" w:type="dxa"/>
+              <w:right w:w="40" w:type="dxa"/>
             </w:tcMar>
           </w:tcPr>
           <w:p>
@@ -3144,10 +3144,10 @@
             <w:tcW w:type="dxa" w:w="1728"/>
             <w:vAlign w:val="center"/>
             <w:tcMar>
-              <w:top w:w="30" w:type="dxa"/>
-              <w:bottom w:w="30" w:type="dxa"/>
-              <w:left w:w="45" w:type="dxa"/>
-              <w:right w:w="45" w:type="dxa"/>
+              <w:top w:w="25" w:type="dxa"/>
+              <w:bottom w:w="25" w:type="dxa"/>
+              <w:left w:w="40" w:type="dxa"/>
+              <w:right w:w="40" w:type="dxa"/>
             </w:tcMar>
           </w:tcPr>
           <w:p>
@@ -3158,11 +3158,58 @@
             <w:r>
               <w:rPr>
                 <w:rFonts w:ascii="Times New Roman" w:hAnsi="Times New Roman"/>
-                <w:b w:val="0"/>
+                <w:i/>
+                <w:sz w:val="14"/>
+              </w:rPr>
+              <w:t>Micrococcus luteus</w:t>
+            </w:r>
+            <w:r>
+              <w:rPr>
+                <w:rFonts w:ascii="Times New Roman" w:hAnsi="Times New Roman"/>
+                <w:sz w:val="14"/>
+              </w:rPr>
+              <w:br/>
+              <w:br/>
+            </w:r>
+            <w:r>
+              <w:rPr>
+                <w:rFonts w:ascii="Times New Roman" w:hAnsi="Times New Roman"/>
+                <w:i/>
+                <w:sz w:val="14"/>
+              </w:rPr>
+              <w:t>Kocuria indica</w:t>
+            </w:r>
+            <w:r>
+              <w:rPr>
+                <w:rFonts w:ascii="Times New Roman" w:hAnsi="Times New Roman"/>
+                <w:sz w:val="14"/>
+              </w:rPr>
+              <w:br/>
+              <w:br/>
+            </w:r>
+            <w:r>
+              <w:rPr>
+                <w:rFonts w:ascii="Times New Roman" w:hAnsi="Times New Roman"/>
+                <w:i/>
+                <w:sz w:val="14"/>
+              </w:rPr>
+              <w:t>Kocuria rhizophila</w:t>
+            </w:r>
+            <w:r>
+              <w:rPr>
+                <w:rFonts w:ascii="Times New Roman" w:hAnsi="Times New Roman"/>
+                <w:sz w:val="14"/>
+              </w:rPr>
+              <w:br/>
+              <w:br/>
+            </w:r>
+            <w:r>
+              <w:rPr>
+                <w:rFonts w:ascii="Times New Roman" w:hAnsi="Times New Roman"/>
                 <w:i w:val="0"/>
                 <w:sz w:val="14"/>
               </w:rPr>
-              <w:t>Pending</w:t>
+              <w:t>Pending FunITS</w:t>
             </w:r>
           </w:p>
         </w:tc>
@@ -3171,10 +3218,10 @@
             <w:tcW w:type="dxa" w:w="864"/>
             <w:vAlign w:val="center"/>
             <w:tcMar>
-              <w:top w:w="30" w:type="dxa"/>
-              <w:bottom w:w="30" w:type="dxa"/>
-              <w:left w:w="45" w:type="dxa"/>
-              <w:right w:w="45" w:type="dxa"/>
+              <w:top w:w="25" w:type="dxa"/>
+              <w:bottom w:w="25" w:type="dxa"/>
+              <w:left w:w="40" w:type="dxa"/>
+              <w:right w:w="40" w:type="dxa"/>
             </w:tcMar>
           </w:tcPr>
           <w:p>
@@ -3201,10 +3248,10 @@
             <w:gridSpan w:val="9"/>
             <w:vAlign w:val="center"/>
             <w:tcMar>
-              <w:top w:w="30" w:type="dxa"/>
-              <w:bottom w:w="30" w:type="dxa"/>
-              <w:left w:w="45" w:type="dxa"/>
-              <w:right w:w="45" w:type="dxa"/>
+              <w:top w:w="25" w:type="dxa"/>
+              <w:bottom w:w="25" w:type="dxa"/>
+              <w:left w:w="40" w:type="dxa"/>
+              <w:right w:w="40" w:type="dxa"/>
             </w:tcMar>
             <w:shd w:fill="E8E8E8"/>
           </w:tcPr>
@@ -3231,10 +3278,10 @@
             <w:tcW w:type="dxa" w:w="1728"/>
             <w:vAlign w:val="center"/>
             <w:tcMar>
-              <w:top w:w="30" w:type="dxa"/>
-              <w:bottom w:w="30" w:type="dxa"/>
-              <w:left w:w="45" w:type="dxa"/>
-              <w:right w:w="45" w:type="dxa"/>
+              <w:top w:w="25" w:type="dxa"/>
+              <w:bottom w:w="25" w:type="dxa"/>
+              <w:left w:w="40" w:type="dxa"/>
+              <w:right w:w="40" w:type="dxa"/>
             </w:tcMar>
           </w:tcPr>
           <w:p>
@@ -3258,10 +3305,10 @@
             <w:tcW w:type="dxa" w:w="792"/>
             <w:vAlign w:val="center"/>
             <w:tcMar>
-              <w:top w:w="30" w:type="dxa"/>
-              <w:bottom w:w="30" w:type="dxa"/>
-              <w:left w:w="45" w:type="dxa"/>
-              <w:right w:w="45" w:type="dxa"/>
+              <w:top w:w="25" w:type="dxa"/>
+              <w:bottom w:w="25" w:type="dxa"/>
+              <w:left w:w="40" w:type="dxa"/>
+              <w:right w:w="40" w:type="dxa"/>
             </w:tcMar>
           </w:tcPr>
           <w:p>
@@ -3285,10 +3332,10 @@
             <w:tcW w:type="dxa" w:w="864"/>
             <w:vAlign w:val="center"/>
             <w:tcMar>
-              <w:top w:w="30" w:type="dxa"/>
-              <w:bottom w:w="30" w:type="dxa"/>
-              <w:left w:w="45" w:type="dxa"/>
-              <w:right w:w="45" w:type="dxa"/>
+              <w:top w:w="25" w:type="dxa"/>
+              <w:bottom w:w="25" w:type="dxa"/>
+              <w:left w:w="40" w:type="dxa"/>
+              <w:right w:w="40" w:type="dxa"/>
             </w:tcMar>
           </w:tcPr>
           <w:p>
@@ -3312,10 +3359,10 @@
             <w:tcW w:type="dxa" w:w="720"/>
             <w:vAlign w:val="center"/>
             <w:tcMar>
-              <w:top w:w="30" w:type="dxa"/>
-              <w:bottom w:w="30" w:type="dxa"/>
-              <w:left w:w="45" w:type="dxa"/>
-              <w:right w:w="45" w:type="dxa"/>
+              <w:top w:w="25" w:type="dxa"/>
+              <w:bottom w:w="25" w:type="dxa"/>
+              <w:left w:w="40" w:type="dxa"/>
+              <w:right w:w="40" w:type="dxa"/>
             </w:tcMar>
           </w:tcPr>
           <w:p>
@@ -3339,10 +3386,10 @@
             <w:tcW w:type="dxa" w:w="1368"/>
             <w:vAlign w:val="center"/>
             <w:tcMar>
-              <w:top w:w="30" w:type="dxa"/>
-              <w:bottom w:w="30" w:type="dxa"/>
-              <w:left w:w="45" w:type="dxa"/>
-              <w:right w:w="45" w:type="dxa"/>
+              <w:top w:w="25" w:type="dxa"/>
+              <w:bottom w:w="25" w:type="dxa"/>
+              <w:left w:w="40" w:type="dxa"/>
+              <w:right w:w="40" w:type="dxa"/>
             </w:tcMar>
           </w:tcPr>
           <w:p>
@@ -3366,10 +3413,10 @@
             <w:tcW w:type="dxa" w:w="1368"/>
             <w:vAlign w:val="center"/>
             <w:tcMar>
-              <w:top w:w="30" w:type="dxa"/>
-              <w:bottom w:w="30" w:type="dxa"/>
-              <w:left w:w="45" w:type="dxa"/>
-              <w:right w:w="45" w:type="dxa"/>
+              <w:top w:w="25" w:type="dxa"/>
+              <w:bottom w:w="25" w:type="dxa"/>
+              <w:left w:w="40" w:type="dxa"/>
+              <w:right w:w="40" w:type="dxa"/>
             </w:tcMar>
           </w:tcPr>
           <w:p>
@@ -3393,10 +3440,10 @@
             <w:tcW w:type="dxa" w:w="1368"/>
             <w:vAlign w:val="center"/>
             <w:tcMar>
-              <w:top w:w="30" w:type="dxa"/>
-              <w:bottom w:w="30" w:type="dxa"/>
-              <w:left w:w="45" w:type="dxa"/>
-              <w:right w:w="45" w:type="dxa"/>
+              <w:top w:w="25" w:type="dxa"/>
+              <w:bottom w:w="25" w:type="dxa"/>
+              <w:left w:w="40" w:type="dxa"/>
+              <w:right w:w="40" w:type="dxa"/>
             </w:tcMar>
           </w:tcPr>
           <w:p>
@@ -3418,10 +3465,10 @@
             <w:tcW w:type="dxa" w:w="1728"/>
             <w:vAlign w:val="center"/>
             <w:tcMar>
-              <w:top w:w="30" w:type="dxa"/>
-              <w:bottom w:w="30" w:type="dxa"/>
-              <w:left w:w="45" w:type="dxa"/>
-              <w:right w:w="45" w:type="dxa"/>
+              <w:top w:w="25" w:type="dxa"/>
+              <w:bottom w:w="25" w:type="dxa"/>
+              <w:left w:w="40" w:type="dxa"/>
+              <w:right w:w="40" w:type="dxa"/>
             </w:tcMar>
           </w:tcPr>
           <w:p>
@@ -3445,10 +3492,10 @@
             <w:tcW w:type="dxa" w:w="864"/>
             <w:vAlign w:val="center"/>
             <w:tcMar>
-              <w:top w:w="30" w:type="dxa"/>
-              <w:bottom w:w="30" w:type="dxa"/>
-              <w:left w:w="45" w:type="dxa"/>
-              <w:right w:w="45" w:type="dxa"/>
+              <w:top w:w="25" w:type="dxa"/>
+              <w:bottom w:w="25" w:type="dxa"/>
+              <w:left w:w="40" w:type="dxa"/>
+              <w:right w:w="40" w:type="dxa"/>
             </w:tcMar>
           </w:tcPr>
           <w:p>
@@ -3471,7 +3518,7 @@
     </w:tbl>
     <w:sectPr>
       <w:pgSz w:w="12240" w:h="15840"/>
-      <w:pgMar w:top="576" w:right="720" w:bottom="576" w:left="720" w:header="720" w:footer="720" w:gutter="0"/>
+      <w:pgMar w:top="504" w:right="720" w:bottom="504" w:left="720" w:header="720" w:footer="720" w:gutter="0"/>
       <w:cols w:space="720"/>
       <w:docGrid w:linePitch="360"/>
     </w:sectPr>

</xml_diff>

<commit_message>
feat(oos-262329): harmonize full morphology breakdown, 2x200mL TSB, RS cleaning standard, and PRD ground truth tables
</commit_message>
<xml_diff>
--- a/Tables OOS-262329 GoGoMeds Select (E10747) - USP71.docx
+++ b/Tables OOS-262329 GoGoMeds Select (E10747) - USP71.docx
@@ -40,7 +40,7 @@
       <w:tr>
         <w:tc>
           <w:tcPr>
-            <w:tcW w:type="dxa" w:w="1728"/>
+            <w:tcW w:type="dxa" w:w="1584"/>
             <w:vAlign w:val="center"/>
             <w:tcMar>
               <w:top w:w="25" w:type="dxa"/>
@@ -67,7 +67,7 @@
         </w:tc>
         <w:tc>
           <w:tcPr>
-            <w:tcW w:type="dxa" w:w="1728"/>
+            <w:tcW w:type="dxa" w:w="1584"/>
             <w:vAlign w:val="center"/>
             <w:tcMar>
               <w:top w:w="25" w:type="dxa"/>
@@ -148,7 +148,7 @@
         </w:tc>
         <w:tc>
           <w:tcPr>
-            <w:tcW w:type="dxa" w:w="1656"/>
+            <w:tcW w:type="dxa" w:w="2160"/>
             <w:vAlign w:val="center"/>
             <w:tcMar>
               <w:top w:w="25" w:type="dxa"/>
@@ -175,7 +175,7 @@
         </w:tc>
         <w:tc>
           <w:tcPr>
-            <w:tcW w:type="dxa" w:w="2304"/>
+            <w:tcW w:type="dxa" w:w="2088"/>
             <w:vAlign w:val="center"/>
             <w:tcMar>
               <w:top w:w="25" w:type="dxa"/>
@@ -204,7 +204,7 @@
       <w:tr>
         <w:tc>
           <w:tcPr>
-            <w:tcW w:type="dxa" w:w="1728"/>
+            <w:tcW w:type="dxa" w:w="1584"/>
             <w:vAlign w:val="center"/>
             <w:tcMar>
               <w:top w:w="25" w:type="dxa"/>
@@ -231,7 +231,7 @@
         </w:tc>
         <w:tc>
           <w:tcPr>
-            <w:tcW w:type="dxa" w:w="1728"/>
+            <w:tcW w:type="dxa" w:w="1584"/>
             <w:vAlign w:val="center"/>
             <w:tcMar>
               <w:top w:w="25" w:type="dxa"/>
@@ -318,7 +318,7 @@
         </w:tc>
         <w:tc>
           <w:tcPr>
-            <w:tcW w:type="dxa" w:w="1656"/>
+            <w:tcW w:type="dxa" w:w="2160"/>
             <w:vAlign w:val="center"/>
             <w:tcMar>
               <w:top w:w="25" w:type="dxa"/>
@@ -339,13 +339,13 @@
                 <w:i w:val="0"/>
                 <w:sz w:val="14"/>
               </w:rPr>
-              <w:t>TSB</w:t>
+              <w:t>2 x 200mL TSB (Original and Subculture Bottles)</w:t>
             </w:r>
           </w:p>
         </w:tc>
         <w:tc>
           <w:tcPr>
-            <w:tcW w:type="dxa" w:w="2304"/>
+            <w:tcW w:type="dxa" w:w="2088"/>
             <w:vAlign w:val="center"/>
             <w:tcMar>
               <w:top w:w="25" w:type="dxa"/>
@@ -362,11 +362,25 @@
             <w:r>
               <w:rPr>
                 <w:rFonts w:ascii="Times New Roman" w:hAnsi="Times New Roman"/>
-                <w:b w:val="0"/>
                 <w:i/>
                 <w:sz w:val="14"/>
               </w:rPr>
               <w:t>Bacillus megaterium</w:t>
+            </w:r>
+            <w:r>
+              <w:rPr>
+                <w:rFonts w:ascii="Times New Roman" w:hAnsi="Times New Roman"/>
+                <w:sz w:val="14"/>
+              </w:rPr>
+              <w:br/>
+            </w:r>
+            <w:r>
+              <w:rPr>
+                <w:rFonts w:ascii="Times New Roman" w:hAnsi="Times New Roman"/>
+                <w:i w:val="0"/>
+                <w:sz w:val="14"/>
+              </w:rPr>
+              <w:t>(Gram (+) rods)</w:t>
             </w:r>
           </w:p>
         </w:tc>
@@ -387,7 +401,7 @@
           <w:sz w:val="17"/>
           <w:u w:val="single"/>
         </w:rPr>
-        <w:t>Table 2: Environmental Monitoring from Processing Performed on 23Sep26</w:t>
+        <w:t>Table 2: Environmental Monitoring from Testing Performed on 23Sep26</w:t>
       </w:r>
     </w:p>
     <w:tbl>
@@ -418,7 +432,7 @@
       <w:tr>
         <w:tc>
           <w:tcPr>
-            <w:tcW w:type="dxa" w:w="1728"/>
+            <w:tcW w:type="dxa" w:w="2160"/>
             <w:vAlign w:val="center"/>
             <w:tcMar>
               <w:top w:w="25" w:type="dxa"/>
@@ -532,7 +546,7 @@
         </w:tc>
         <w:tc>
           <w:tcPr>
-            <w:tcW w:type="dxa" w:w="1368"/>
+            <w:tcW w:type="dxa" w:w="1224"/>
             <w:vAlign w:val="center"/>
             <w:tcMar>
               <w:top w:w="25" w:type="dxa"/>
@@ -559,7 +573,7 @@
         </w:tc>
         <w:tc>
           <w:tcPr>
-            <w:tcW w:type="dxa" w:w="1368"/>
+            <w:tcW w:type="dxa" w:w="1224"/>
             <w:vAlign w:val="center"/>
             <w:tcMar>
               <w:top w:w="25" w:type="dxa"/>
@@ -586,7 +600,7 @@
         </w:tc>
         <w:tc>
           <w:tcPr>
-            <w:tcW w:type="dxa" w:w="1368"/>
+            <w:tcW w:type="dxa" w:w="1224"/>
             <w:vAlign w:val="center"/>
             <w:tcMar>
               <w:top w:w="25" w:type="dxa"/>
@@ -613,7 +627,7 @@
         </w:tc>
         <w:tc>
           <w:tcPr>
-            <w:tcW w:type="dxa" w:w="1728"/>
+            <w:tcW w:type="dxa" w:w="1944"/>
             <w:vAlign w:val="center"/>
             <w:tcMar>
               <w:top w:w="25" w:type="dxa"/>
@@ -640,7 +654,7 @@
         </w:tc>
         <w:tc>
           <w:tcPr>
-            <w:tcW w:type="dxa" w:w="864"/>
+            <w:tcW w:type="dxa" w:w="648"/>
             <w:vAlign w:val="center"/>
             <w:tcMar>
               <w:top w:w="25" w:type="dxa"/>
@@ -669,16 +683,15 @@
       <w:tr>
         <w:tc>
           <w:tcPr>
-            <w:tcW w:type="dxa" w:w="864"/>
-            <w:gridSpan w:val="9"/>
-            <w:vAlign w:val="center"/>
+            <w:tcW w:type="dxa" w:w="2160"/>
+            <w:shd w:fill="D9D9D9"/>
             <w:tcMar>
-              <w:top w:w="25" w:type="dxa"/>
-              <w:bottom w:w="25" w:type="dxa"/>
+              <w:top w:w="20" w:type="dxa"/>
+              <w:bottom w:w="20" w:type="dxa"/>
               <w:left w:w="40" w:type="dxa"/>
               <w:right w:w="40" w:type="dxa"/>
             </w:tcMar>
-            <w:shd w:fill="E8E8E8"/>
+            <w:hMerge w:val="restart"/>
           </w:tcPr>
           <w:p>
             <w:pPr>
@@ -689,18 +702,73 @@
               <w:rPr>
                 <w:rFonts w:ascii="Times New Roman" w:hAnsi="Times New Roman"/>
                 <w:b/>
-                <w:i w:val="0"/>
                 <w:sz w:val="14"/>
               </w:rPr>
               <w:t>Personnel EM</w:t>
             </w:r>
           </w:p>
         </w:tc>
+        <w:tc>
+          <w:tcPr>
+            <w:tcW w:type="dxa" w:w="792"/>
+            <w:hMerge w:val="continue"/>
+          </w:tcPr>
+          <w:p/>
+        </w:tc>
+        <w:tc>
+          <w:tcPr>
+            <w:tcW w:type="dxa" w:w="864"/>
+            <w:hMerge w:val="continue"/>
+          </w:tcPr>
+          <w:p/>
+        </w:tc>
+        <w:tc>
+          <w:tcPr>
+            <w:tcW w:type="dxa" w:w="720"/>
+            <w:hMerge w:val="continue"/>
+          </w:tcPr>
+          <w:p/>
+        </w:tc>
+        <w:tc>
+          <w:tcPr>
+            <w:tcW w:type="dxa" w:w="1224"/>
+            <w:hMerge w:val="continue"/>
+          </w:tcPr>
+          <w:p/>
+        </w:tc>
+        <w:tc>
+          <w:tcPr>
+            <w:tcW w:type="dxa" w:w="1224"/>
+            <w:hMerge w:val="continue"/>
+          </w:tcPr>
+          <w:p/>
+        </w:tc>
+        <w:tc>
+          <w:tcPr>
+            <w:tcW w:type="dxa" w:w="1224"/>
+            <w:hMerge w:val="continue"/>
+          </w:tcPr>
+          <w:p/>
+        </w:tc>
+        <w:tc>
+          <w:tcPr>
+            <w:tcW w:type="dxa" w:w="1944"/>
+            <w:hMerge w:val="continue"/>
+          </w:tcPr>
+          <w:p/>
+        </w:tc>
+        <w:tc>
+          <w:tcPr>
+            <w:tcW w:type="dxa" w:w="648"/>
+            <w:hMerge w:val="continue"/>
+          </w:tcPr>
+          <w:p/>
+        </w:tc>
       </w:tr>
       <w:tr>
         <w:tc>
           <w:tcPr>
-            <w:tcW w:type="dxa" w:w="1728"/>
+            <w:tcW w:type="dxa" w:w="2160"/>
             <w:vAlign w:val="center"/>
             <w:tcMar>
               <w:top w:w="25" w:type="dxa"/>
@@ -808,7 +876,7 @@
         </w:tc>
         <w:tc>
           <w:tcPr>
-            <w:tcW w:type="dxa" w:w="1368"/>
+            <w:tcW w:type="dxa" w:w="1224"/>
             <w:vAlign w:val="center"/>
             <w:tcMar>
               <w:top w:w="25" w:type="dxa"/>
@@ -835,7 +903,7 @@
         </w:tc>
         <w:tc>
           <w:tcPr>
-            <w:tcW w:type="dxa" w:w="1368"/>
+            <w:tcW w:type="dxa" w:w="1224"/>
             <w:vAlign w:val="center"/>
             <w:tcMar>
               <w:top w:w="25" w:type="dxa"/>
@@ -862,7 +930,7 @@
         </w:tc>
         <w:tc>
           <w:tcPr>
-            <w:tcW w:type="dxa" w:w="1368"/>
+            <w:tcW w:type="dxa" w:w="1224"/>
             <w:vAlign w:val="center"/>
             <w:tcMar>
               <w:top w:w="25" w:type="dxa"/>
@@ -887,7 +955,7 @@
         </w:tc>
         <w:tc>
           <w:tcPr>
-            <w:tcW w:type="dxa" w:w="1728"/>
+            <w:tcW w:type="dxa" w:w="1944"/>
             <w:vAlign w:val="center"/>
             <w:tcMar>
               <w:top w:w="25" w:type="dxa"/>
@@ -904,8 +972,6 @@
             <w:r>
               <w:rPr>
                 <w:rFonts w:ascii="Times New Roman" w:hAnsi="Times New Roman"/>
-                <w:b w:val="0"/>
-                <w:i w:val="0"/>
                 <w:sz w:val="14"/>
               </w:rPr>
               <w:t>Not Applicable</w:t>
@@ -914,7 +980,7 @@
         </w:tc>
         <w:tc>
           <w:tcPr>
-            <w:tcW w:type="dxa" w:w="864"/>
+            <w:tcW w:type="dxa" w:w="648"/>
             <w:vAlign w:val="center"/>
             <w:tcMar>
               <w:top w:w="25" w:type="dxa"/>
@@ -943,7 +1009,7 @@
       <w:tr>
         <w:tc>
           <w:tcPr>
-            <w:tcW w:type="dxa" w:w="1728"/>
+            <w:tcW w:type="dxa" w:w="2160"/>
             <w:vAlign w:val="center"/>
             <w:tcMar>
               <w:top w:w="25" w:type="dxa"/>
@@ -1051,7 +1117,7 @@
         </w:tc>
         <w:tc>
           <w:tcPr>
-            <w:tcW w:type="dxa" w:w="1368"/>
+            <w:tcW w:type="dxa" w:w="1224"/>
             <w:vAlign w:val="center"/>
             <w:tcMar>
               <w:top w:w="25" w:type="dxa"/>
@@ -1078,7 +1144,7 @@
         </w:tc>
         <w:tc>
           <w:tcPr>
-            <w:tcW w:type="dxa" w:w="1368"/>
+            <w:tcW w:type="dxa" w:w="1224"/>
             <w:vAlign w:val="center"/>
             <w:tcMar>
               <w:top w:w="25" w:type="dxa"/>
@@ -1105,7 +1171,7 @@
         </w:tc>
         <w:tc>
           <w:tcPr>
-            <w:tcW w:type="dxa" w:w="1368"/>
+            <w:tcW w:type="dxa" w:w="1224"/>
             <w:vAlign w:val="center"/>
             <w:tcMar>
               <w:top w:w="25" w:type="dxa"/>
@@ -1130,7 +1196,7 @@
         </w:tc>
         <w:tc>
           <w:tcPr>
-            <w:tcW w:type="dxa" w:w="1728"/>
+            <w:tcW w:type="dxa" w:w="1944"/>
             <w:vAlign w:val="center"/>
             <w:tcMar>
               <w:top w:w="25" w:type="dxa"/>
@@ -1147,8 +1213,6 @@
             <w:r>
               <w:rPr>
                 <w:rFonts w:ascii="Times New Roman" w:hAnsi="Times New Roman"/>
-                <w:b w:val="0"/>
-                <w:i w:val="0"/>
                 <w:sz w:val="14"/>
               </w:rPr>
               <w:t>Not Applicable</w:t>
@@ -1157,7 +1221,7 @@
         </w:tc>
         <w:tc>
           <w:tcPr>
-            <w:tcW w:type="dxa" w:w="864"/>
+            <w:tcW w:type="dxa" w:w="648"/>
             <w:vAlign w:val="center"/>
             <w:tcMar>
               <w:top w:w="25" w:type="dxa"/>
@@ -1186,7 +1250,7 @@
       <w:tr>
         <w:tc>
           <w:tcPr>
-            <w:tcW w:type="dxa" w:w="1728"/>
+            <w:tcW w:type="dxa" w:w="2160"/>
             <w:vAlign w:val="center"/>
             <w:tcMar>
               <w:top w:w="25" w:type="dxa"/>
@@ -1294,7 +1358,7 @@
         </w:tc>
         <w:tc>
           <w:tcPr>
-            <w:tcW w:type="dxa" w:w="1368"/>
+            <w:tcW w:type="dxa" w:w="1224"/>
             <w:vAlign w:val="center"/>
             <w:tcMar>
               <w:top w:w="25" w:type="dxa"/>
@@ -1321,7 +1385,7 @@
         </w:tc>
         <w:tc>
           <w:tcPr>
-            <w:tcW w:type="dxa" w:w="1368"/>
+            <w:tcW w:type="dxa" w:w="1224"/>
             <w:vAlign w:val="center"/>
             <w:tcMar>
               <w:top w:w="25" w:type="dxa"/>
@@ -1348,7 +1412,7 @@
         </w:tc>
         <w:tc>
           <w:tcPr>
-            <w:tcW w:type="dxa" w:w="1368"/>
+            <w:tcW w:type="dxa" w:w="1224"/>
             <w:vAlign w:val="center"/>
             <w:tcMar>
               <w:top w:w="25" w:type="dxa"/>
@@ -1373,7 +1437,7 @@
         </w:tc>
         <w:tc>
           <w:tcPr>
-            <w:tcW w:type="dxa" w:w="1728"/>
+            <w:tcW w:type="dxa" w:w="1944"/>
             <w:vAlign w:val="center"/>
             <w:tcMar>
               <w:top w:w="25" w:type="dxa"/>
@@ -1390,8 +1454,6 @@
             <w:r>
               <w:rPr>
                 <w:rFonts w:ascii="Times New Roman" w:hAnsi="Times New Roman"/>
-                <w:b w:val="0"/>
-                <w:i w:val="0"/>
                 <w:sz w:val="14"/>
               </w:rPr>
               <w:t>Not Applicable</w:t>
@@ -1400,7 +1462,7 @@
         </w:tc>
         <w:tc>
           <w:tcPr>
-            <w:tcW w:type="dxa" w:w="864"/>
+            <w:tcW w:type="dxa" w:w="648"/>
             <w:vAlign w:val="center"/>
             <w:tcMar>
               <w:top w:w="25" w:type="dxa"/>
@@ -1429,16 +1491,15 @@
       <w:tr>
         <w:tc>
           <w:tcPr>
-            <w:tcW w:type="dxa" w:w="864"/>
-            <w:gridSpan w:val="9"/>
-            <w:vAlign w:val="center"/>
+            <w:tcW w:type="dxa" w:w="2160"/>
+            <w:shd w:fill="D9D9D9"/>
             <w:tcMar>
-              <w:top w:w="25" w:type="dxa"/>
-              <w:bottom w:w="25" w:type="dxa"/>
+              <w:top w:w="20" w:type="dxa"/>
+              <w:bottom w:w="20" w:type="dxa"/>
               <w:left w:w="40" w:type="dxa"/>
               <w:right w:w="40" w:type="dxa"/>
             </w:tcMar>
-            <w:shd w:fill="E8E8E8"/>
+            <w:hMerge w:val="restart"/>
           </w:tcPr>
           <w:p>
             <w:pPr>
@@ -1449,18 +1510,73 @@
               <w:rPr>
                 <w:rFonts w:ascii="Times New Roman" w:hAnsi="Times New Roman"/>
                 <w:b/>
-                <w:i w:val="0"/>
                 <w:sz w:val="14"/>
               </w:rPr>
               <w:t>Biological Safety Cabinet EM for E001314</w:t>
             </w:r>
           </w:p>
         </w:tc>
+        <w:tc>
+          <w:tcPr>
+            <w:tcW w:type="dxa" w:w="792"/>
+            <w:hMerge w:val="continue"/>
+          </w:tcPr>
+          <w:p/>
+        </w:tc>
+        <w:tc>
+          <w:tcPr>
+            <w:tcW w:type="dxa" w:w="864"/>
+            <w:hMerge w:val="continue"/>
+          </w:tcPr>
+          <w:p/>
+        </w:tc>
+        <w:tc>
+          <w:tcPr>
+            <w:tcW w:type="dxa" w:w="720"/>
+            <w:hMerge w:val="continue"/>
+          </w:tcPr>
+          <w:p/>
+        </w:tc>
+        <w:tc>
+          <w:tcPr>
+            <w:tcW w:type="dxa" w:w="1224"/>
+            <w:hMerge w:val="continue"/>
+          </w:tcPr>
+          <w:p/>
+        </w:tc>
+        <w:tc>
+          <w:tcPr>
+            <w:tcW w:type="dxa" w:w="1224"/>
+            <w:hMerge w:val="continue"/>
+          </w:tcPr>
+          <w:p/>
+        </w:tc>
+        <w:tc>
+          <w:tcPr>
+            <w:tcW w:type="dxa" w:w="1224"/>
+            <w:hMerge w:val="continue"/>
+          </w:tcPr>
+          <w:p/>
+        </w:tc>
+        <w:tc>
+          <w:tcPr>
+            <w:tcW w:type="dxa" w:w="1944"/>
+            <w:hMerge w:val="continue"/>
+          </w:tcPr>
+          <w:p/>
+        </w:tc>
+        <w:tc>
+          <w:tcPr>
+            <w:tcW w:type="dxa" w:w="648"/>
+            <w:hMerge w:val="continue"/>
+          </w:tcPr>
+          <w:p/>
+        </w:tc>
       </w:tr>
       <w:tr>
         <w:tc>
           <w:tcPr>
-            <w:tcW w:type="dxa" w:w="1728"/>
+            <w:tcW w:type="dxa" w:w="2160"/>
             <w:vAlign w:val="center"/>
             <w:tcMar>
               <w:top w:w="25" w:type="dxa"/>
@@ -1568,7 +1684,7 @@
         </w:tc>
         <w:tc>
           <w:tcPr>
-            <w:tcW w:type="dxa" w:w="1368"/>
+            <w:tcW w:type="dxa" w:w="1224"/>
             <w:vAlign w:val="center"/>
             <w:tcMar>
               <w:top w:w="25" w:type="dxa"/>
@@ -1595,7 +1711,7 @@
         </w:tc>
         <w:tc>
           <w:tcPr>
-            <w:tcW w:type="dxa" w:w="1368"/>
+            <w:tcW w:type="dxa" w:w="1224"/>
             <w:vAlign w:val="center"/>
             <w:tcMar>
               <w:top w:w="25" w:type="dxa"/>
@@ -1622,7 +1738,7 @@
         </w:tc>
         <w:tc>
           <w:tcPr>
-            <w:tcW w:type="dxa" w:w="1368"/>
+            <w:tcW w:type="dxa" w:w="1224"/>
             <w:vAlign w:val="center"/>
             <w:tcMar>
               <w:top w:w="25" w:type="dxa"/>
@@ -1647,7 +1763,7 @@
         </w:tc>
         <w:tc>
           <w:tcPr>
-            <w:tcW w:type="dxa" w:w="1728"/>
+            <w:tcW w:type="dxa" w:w="1944"/>
             <w:vAlign w:val="center"/>
             <w:tcMar>
               <w:top w:w="25" w:type="dxa"/>
@@ -1664,8 +1780,6 @@
             <w:r>
               <w:rPr>
                 <w:rFonts w:ascii="Times New Roman" w:hAnsi="Times New Roman"/>
-                <w:b w:val="0"/>
-                <w:i w:val="0"/>
                 <w:sz w:val="14"/>
               </w:rPr>
               <w:t>Not Applicable</w:t>
@@ -1674,7 +1788,7 @@
         </w:tc>
         <w:tc>
           <w:tcPr>
-            <w:tcW w:type="dxa" w:w="864"/>
+            <w:tcW w:type="dxa" w:w="648"/>
             <w:vAlign w:val="center"/>
             <w:tcMar>
               <w:top w:w="25" w:type="dxa"/>
@@ -1703,7 +1817,7 @@
       <w:tr>
         <w:tc>
           <w:tcPr>
-            <w:tcW w:type="dxa" w:w="1728"/>
+            <w:tcW w:type="dxa" w:w="2160"/>
             <w:vAlign w:val="center"/>
             <w:tcMar>
               <w:top w:w="25" w:type="dxa"/>
@@ -1811,7 +1925,7 @@
         </w:tc>
         <w:tc>
           <w:tcPr>
-            <w:tcW w:type="dxa" w:w="1368"/>
+            <w:tcW w:type="dxa" w:w="1224"/>
             <w:vAlign w:val="center"/>
             <w:tcMar>
               <w:top w:w="25" w:type="dxa"/>
@@ -1838,7 +1952,7 @@
         </w:tc>
         <w:tc>
           <w:tcPr>
-            <w:tcW w:type="dxa" w:w="1368"/>
+            <w:tcW w:type="dxa" w:w="1224"/>
             <w:vAlign w:val="center"/>
             <w:tcMar>
               <w:top w:w="25" w:type="dxa"/>
@@ -1865,7 +1979,7 @@
         </w:tc>
         <w:tc>
           <w:tcPr>
-            <w:tcW w:type="dxa" w:w="1368"/>
+            <w:tcW w:type="dxa" w:w="1224"/>
             <w:vAlign w:val="center"/>
             <w:tcMar>
               <w:top w:w="25" w:type="dxa"/>
@@ -1890,7 +2004,7 @@
         </w:tc>
         <w:tc>
           <w:tcPr>
-            <w:tcW w:type="dxa" w:w="1728"/>
+            <w:tcW w:type="dxa" w:w="1944"/>
             <w:vAlign w:val="center"/>
             <w:tcMar>
               <w:top w:w="25" w:type="dxa"/>
@@ -1907,8 +2021,6 @@
             <w:r>
               <w:rPr>
                 <w:rFonts w:ascii="Times New Roman" w:hAnsi="Times New Roman"/>
-                <w:b w:val="0"/>
-                <w:i w:val="0"/>
                 <w:sz w:val="14"/>
               </w:rPr>
               <w:t>Not Applicable</w:t>
@@ -1917,7 +2029,7 @@
         </w:tc>
         <w:tc>
           <w:tcPr>
-            <w:tcW w:type="dxa" w:w="864"/>
+            <w:tcW w:type="dxa" w:w="648"/>
             <w:vAlign w:val="center"/>
             <w:tcMar>
               <w:top w:w="25" w:type="dxa"/>
@@ -1946,7 +2058,7 @@
       <w:tr>
         <w:tc>
           <w:tcPr>
-            <w:tcW w:type="dxa" w:w="1728"/>
+            <w:tcW w:type="dxa" w:w="2160"/>
             <w:vAlign w:val="center"/>
             <w:tcMar>
               <w:top w:w="25" w:type="dxa"/>
@@ -2054,7 +2166,7 @@
         </w:tc>
         <w:tc>
           <w:tcPr>
-            <w:tcW w:type="dxa" w:w="1368"/>
+            <w:tcW w:type="dxa" w:w="1224"/>
             <w:vAlign w:val="center"/>
             <w:tcMar>
               <w:top w:w="25" w:type="dxa"/>
@@ -2081,7 +2193,7 @@
         </w:tc>
         <w:tc>
           <w:tcPr>
-            <w:tcW w:type="dxa" w:w="1368"/>
+            <w:tcW w:type="dxa" w:w="1224"/>
             <w:vAlign w:val="center"/>
             <w:tcMar>
               <w:top w:w="25" w:type="dxa"/>
@@ -2108,7 +2220,7 @@
         </w:tc>
         <w:tc>
           <w:tcPr>
-            <w:tcW w:type="dxa" w:w="1368"/>
+            <w:tcW w:type="dxa" w:w="1224"/>
             <w:vAlign w:val="center"/>
             <w:tcMar>
               <w:top w:w="25" w:type="dxa"/>
@@ -2133,7 +2245,7 @@
         </w:tc>
         <w:tc>
           <w:tcPr>
-            <w:tcW w:type="dxa" w:w="1728"/>
+            <w:tcW w:type="dxa" w:w="1944"/>
             <w:vAlign w:val="center"/>
             <w:tcMar>
               <w:top w:w="25" w:type="dxa"/>
@@ -2150,8 +2262,6 @@
             <w:r>
               <w:rPr>
                 <w:rFonts w:ascii="Times New Roman" w:hAnsi="Times New Roman"/>
-                <w:b w:val="0"/>
-                <w:i w:val="0"/>
                 <w:sz w:val="14"/>
               </w:rPr>
               <w:t>Not Applicable</w:t>
@@ -2160,7 +2270,7 @@
         </w:tc>
         <w:tc>
           <w:tcPr>
-            <w:tcW w:type="dxa" w:w="864"/>
+            <w:tcW w:type="dxa" w:w="648"/>
             <w:vAlign w:val="center"/>
             <w:tcMar>
               <w:top w:w="25" w:type="dxa"/>
@@ -2189,7 +2299,7 @@
       <w:tr>
         <w:tc>
           <w:tcPr>
-            <w:tcW w:type="dxa" w:w="1728"/>
+            <w:tcW w:type="dxa" w:w="2160"/>
             <w:vAlign w:val="center"/>
             <w:tcMar>
               <w:top w:w="25" w:type="dxa"/>
@@ -2297,7 +2407,7 @@
         </w:tc>
         <w:tc>
           <w:tcPr>
-            <w:tcW w:type="dxa" w:w="1368"/>
+            <w:tcW w:type="dxa" w:w="1224"/>
             <w:vAlign w:val="center"/>
             <w:tcMar>
               <w:top w:w="25" w:type="dxa"/>
@@ -2324,7 +2434,7 @@
         </w:tc>
         <w:tc>
           <w:tcPr>
-            <w:tcW w:type="dxa" w:w="1368"/>
+            <w:tcW w:type="dxa" w:w="1224"/>
             <w:vAlign w:val="center"/>
             <w:tcMar>
               <w:top w:w="25" w:type="dxa"/>
@@ -2351,7 +2461,7 @@
         </w:tc>
         <w:tc>
           <w:tcPr>
-            <w:tcW w:type="dxa" w:w="1368"/>
+            <w:tcW w:type="dxa" w:w="1224"/>
             <w:vAlign w:val="center"/>
             <w:tcMar>
               <w:top w:w="25" w:type="dxa"/>
@@ -2376,7 +2486,7 @@
         </w:tc>
         <w:tc>
           <w:tcPr>
-            <w:tcW w:type="dxa" w:w="1728"/>
+            <w:tcW w:type="dxa" w:w="1944"/>
             <w:vAlign w:val="center"/>
             <w:tcMar>
               <w:top w:w="25" w:type="dxa"/>
@@ -2393,8 +2503,6 @@
             <w:r>
               <w:rPr>
                 <w:rFonts w:ascii="Times New Roman" w:hAnsi="Times New Roman"/>
-                <w:b w:val="0"/>
-                <w:i w:val="0"/>
                 <w:sz w:val="14"/>
               </w:rPr>
               <w:t>Not Applicable</w:t>
@@ -2403,7 +2511,7 @@
         </w:tc>
         <w:tc>
           <w:tcPr>
-            <w:tcW w:type="dxa" w:w="864"/>
+            <w:tcW w:type="dxa" w:w="648"/>
             <w:vAlign w:val="center"/>
             <w:tcMar>
               <w:top w:w="25" w:type="dxa"/>
@@ -2432,7 +2540,7 @@
       <w:tr>
         <w:tc>
           <w:tcPr>
-            <w:tcW w:type="dxa" w:w="1728"/>
+            <w:tcW w:type="dxa" w:w="2160"/>
             <w:vAlign w:val="center"/>
             <w:tcMar>
               <w:top w:w="25" w:type="dxa"/>
@@ -2540,7 +2648,7 @@
         </w:tc>
         <w:tc>
           <w:tcPr>
-            <w:tcW w:type="dxa" w:w="1368"/>
+            <w:tcW w:type="dxa" w:w="1224"/>
             <w:vAlign w:val="center"/>
             <w:tcMar>
               <w:top w:w="25" w:type="dxa"/>
@@ -2567,7 +2675,7 @@
         </w:tc>
         <w:tc>
           <w:tcPr>
-            <w:tcW w:type="dxa" w:w="1368"/>
+            <w:tcW w:type="dxa" w:w="1224"/>
             <w:vAlign w:val="center"/>
             <w:tcMar>
               <w:top w:w="25" w:type="dxa"/>
@@ -2594,7 +2702,7 @@
         </w:tc>
         <w:tc>
           <w:tcPr>
-            <w:tcW w:type="dxa" w:w="1368"/>
+            <w:tcW w:type="dxa" w:w="1224"/>
             <w:vAlign w:val="center"/>
             <w:tcMar>
               <w:top w:w="25" w:type="dxa"/>
@@ -2619,7 +2727,7 @@
         </w:tc>
         <w:tc>
           <w:tcPr>
-            <w:tcW w:type="dxa" w:w="1728"/>
+            <w:tcW w:type="dxa" w:w="1944"/>
             <w:vAlign w:val="center"/>
             <w:tcMar>
               <w:top w:w="25" w:type="dxa"/>
@@ -2636,8 +2744,6 @@
             <w:r>
               <w:rPr>
                 <w:rFonts w:ascii="Times New Roman" w:hAnsi="Times New Roman"/>
-                <w:b w:val="0"/>
-                <w:i w:val="0"/>
                 <w:sz w:val="14"/>
               </w:rPr>
               <w:t>Not Applicable</w:t>
@@ -2646,7 +2752,7 @@
         </w:tc>
         <w:tc>
           <w:tcPr>
-            <w:tcW w:type="dxa" w:w="864"/>
+            <w:tcW w:type="dxa" w:w="648"/>
             <w:vAlign w:val="center"/>
             <w:tcMar>
               <w:top w:w="25" w:type="dxa"/>
@@ -2675,7 +2781,7 @@
       <w:tr>
         <w:tc>
           <w:tcPr>
-            <w:tcW w:type="dxa" w:w="1728"/>
+            <w:tcW w:type="dxa" w:w="2160"/>
             <w:vAlign w:val="center"/>
             <w:tcMar>
               <w:top w:w="25" w:type="dxa"/>
@@ -2783,7 +2889,7 @@
         </w:tc>
         <w:tc>
           <w:tcPr>
-            <w:tcW w:type="dxa" w:w="1368"/>
+            <w:tcW w:type="dxa" w:w="1224"/>
             <w:vAlign w:val="center"/>
             <w:tcMar>
               <w:top w:w="25" w:type="dxa"/>
@@ -2810,7 +2916,7 @@
         </w:tc>
         <w:tc>
           <w:tcPr>
-            <w:tcW w:type="dxa" w:w="1368"/>
+            <w:tcW w:type="dxa" w:w="1224"/>
             <w:vAlign w:val="center"/>
             <w:tcMar>
               <w:top w:w="25" w:type="dxa"/>
@@ -2837,7 +2943,7 @@
         </w:tc>
         <w:tc>
           <w:tcPr>
-            <w:tcW w:type="dxa" w:w="1368"/>
+            <w:tcW w:type="dxa" w:w="1224"/>
             <w:vAlign w:val="center"/>
             <w:tcMar>
               <w:top w:w="25" w:type="dxa"/>
@@ -2862,7 +2968,7 @@
         </w:tc>
         <w:tc>
           <w:tcPr>
-            <w:tcW w:type="dxa" w:w="1728"/>
+            <w:tcW w:type="dxa" w:w="1944"/>
             <w:vAlign w:val="center"/>
             <w:tcMar>
               <w:top w:w="25" w:type="dxa"/>
@@ -2879,8 +2985,6 @@
             <w:r>
               <w:rPr>
                 <w:rFonts w:ascii="Times New Roman" w:hAnsi="Times New Roman"/>
-                <w:b w:val="0"/>
-                <w:i w:val="0"/>
                 <w:sz w:val="14"/>
               </w:rPr>
               <w:t>Not Applicable</w:t>
@@ -2889,7 +2993,7 @@
         </w:tc>
         <w:tc>
           <w:tcPr>
-            <w:tcW w:type="dxa" w:w="864"/>
+            <w:tcW w:type="dxa" w:w="648"/>
             <w:vAlign w:val="center"/>
             <w:tcMar>
               <w:top w:w="25" w:type="dxa"/>
@@ -2918,16 +3022,15 @@
       <w:tr>
         <w:tc>
           <w:tcPr>
-            <w:tcW w:type="dxa" w:w="864"/>
-            <w:gridSpan w:val="9"/>
-            <w:vAlign w:val="center"/>
+            <w:tcW w:type="dxa" w:w="2160"/>
+            <w:shd w:fill="D9D9D9"/>
             <w:tcMar>
-              <w:top w:w="25" w:type="dxa"/>
-              <w:bottom w:w="25" w:type="dxa"/>
+              <w:top w:w="20" w:type="dxa"/>
+              <w:bottom w:w="20" w:type="dxa"/>
               <w:left w:w="40" w:type="dxa"/>
               <w:right w:w="40" w:type="dxa"/>
             </w:tcMar>
-            <w:shd w:fill="E8E8E8"/>
+            <w:hMerge w:val="restart"/>
           </w:tcPr>
           <w:p>
             <w:pPr>
@@ -2938,18 +3041,73 @@
               <w:rPr>
                 <w:rFonts w:ascii="Times New Roman" w:hAnsi="Times New Roman"/>
                 <w:b/>
-                <w:i w:val="0"/>
                 <w:sz w:val="14"/>
               </w:rPr>
               <w:t>Weekly Active Air Sampling of Cleanroom Suite 115 (E001737) with Processing BSC</w:t>
             </w:r>
           </w:p>
         </w:tc>
+        <w:tc>
+          <w:tcPr>
+            <w:tcW w:type="dxa" w:w="792"/>
+            <w:hMerge w:val="continue"/>
+          </w:tcPr>
+          <w:p/>
+        </w:tc>
+        <w:tc>
+          <w:tcPr>
+            <w:tcW w:type="dxa" w:w="864"/>
+            <w:hMerge w:val="continue"/>
+          </w:tcPr>
+          <w:p/>
+        </w:tc>
+        <w:tc>
+          <w:tcPr>
+            <w:tcW w:type="dxa" w:w="720"/>
+            <w:hMerge w:val="continue"/>
+          </w:tcPr>
+          <w:p/>
+        </w:tc>
+        <w:tc>
+          <w:tcPr>
+            <w:tcW w:type="dxa" w:w="1224"/>
+            <w:hMerge w:val="continue"/>
+          </w:tcPr>
+          <w:p/>
+        </w:tc>
+        <w:tc>
+          <w:tcPr>
+            <w:tcW w:type="dxa" w:w="1224"/>
+            <w:hMerge w:val="continue"/>
+          </w:tcPr>
+          <w:p/>
+        </w:tc>
+        <w:tc>
+          <w:tcPr>
+            <w:tcW w:type="dxa" w:w="1224"/>
+            <w:hMerge w:val="continue"/>
+          </w:tcPr>
+          <w:p/>
+        </w:tc>
+        <w:tc>
+          <w:tcPr>
+            <w:tcW w:type="dxa" w:w="1944"/>
+            <w:hMerge w:val="continue"/>
+          </w:tcPr>
+          <w:p/>
+        </w:tc>
+        <w:tc>
+          <w:tcPr>
+            <w:tcW w:type="dxa" w:w="648"/>
+            <w:hMerge w:val="continue"/>
+          </w:tcPr>
+          <w:p/>
+        </w:tc>
       </w:tr>
       <w:tr>
         <w:tc>
           <w:tcPr>
-            <w:tcW w:type="dxa" w:w="1728"/>
+            <w:tcW w:type="dxa" w:w="2160"/>
             <w:vAlign w:val="center"/>
             <w:tcMar>
               <w:top w:w="25" w:type="dxa"/>
@@ -3057,7 +3215,7 @@
         </w:tc>
         <w:tc>
           <w:tcPr>
-            <w:tcW w:type="dxa" w:w="1368"/>
+            <w:tcW w:type="dxa" w:w="1224"/>
             <w:vAlign w:val="center"/>
             <w:tcMar>
               <w:top w:w="25" w:type="dxa"/>
@@ -3084,7 +3242,7 @@
         </w:tc>
         <w:tc>
           <w:tcPr>
-            <w:tcW w:type="dxa" w:w="1368"/>
+            <w:tcW w:type="dxa" w:w="1224"/>
             <w:vAlign w:val="center"/>
             <w:tcMar>
               <w:top w:w="25" w:type="dxa"/>
@@ -3111,7 +3269,7 @@
         </w:tc>
         <w:tc>
           <w:tcPr>
-            <w:tcW w:type="dxa" w:w="1368"/>
+            <w:tcW w:type="dxa" w:w="1224"/>
             <w:vAlign w:val="center"/>
             <w:tcMar>
               <w:top w:w="25" w:type="dxa"/>
@@ -3141,7 +3299,7 @@
         </w:tc>
         <w:tc>
           <w:tcPr>
-            <w:tcW w:type="dxa" w:w="1728"/>
+            <w:tcW w:type="dxa" w:w="1944"/>
             <w:vAlign w:val="center"/>
             <w:tcMar>
               <w:top w:w="25" w:type="dxa"/>
@@ -3166,8 +3324,10 @@
             <w:r>
               <w:rPr>
                 <w:rFonts w:ascii="Times New Roman" w:hAnsi="Times New Roman"/>
+                <w:i w:val="0"/>
                 <w:sz w:val="14"/>
               </w:rPr>
+              <w:t xml:space="preserve"> (4 CFUs)</w:t>
               <w:br/>
               <w:br/>
             </w:r>
@@ -3182,10 +3342,10 @@
             <w:r>
               <w:rPr>
                 <w:rFonts w:ascii="Times New Roman" w:hAnsi="Times New Roman"/>
+                <w:i w:val="0"/>
                 <w:sz w:val="14"/>
               </w:rPr>
-              <w:br/>
-              <w:br/>
+              <w:t xml:space="preserve"> and </w:t>
             </w:r>
             <w:r>
               <w:rPr>
@@ -3198,8 +3358,10 @@
             <w:r>
               <w:rPr>
                 <w:rFonts w:ascii="Times New Roman" w:hAnsi="Times New Roman"/>
+                <w:i w:val="0"/>
                 <w:sz w:val="14"/>
               </w:rPr>
+              <w:t xml:space="preserve"> (1 CFU)</w:t>
               <w:br/>
               <w:br/>
             </w:r>
@@ -3209,13 +3371,13 @@
                 <w:i w:val="0"/>
                 <w:sz w:val="14"/>
               </w:rPr>
-              <w:t>Pending FunITS</w:t>
+              <w:t>Pending FunITS (1 CFU, Hyphae)</w:t>
             </w:r>
           </w:p>
         </w:tc>
         <w:tc>
           <w:tcPr>
-            <w:tcW w:type="dxa" w:w="864"/>
+            <w:tcW w:type="dxa" w:w="648"/>
             <w:vAlign w:val="center"/>
             <w:tcMar>
               <w:top w:w="25" w:type="dxa"/>
@@ -3244,16 +3406,15 @@
       <w:tr>
         <w:tc>
           <w:tcPr>
-            <w:tcW w:type="dxa" w:w="864"/>
-            <w:gridSpan w:val="9"/>
-            <w:vAlign w:val="center"/>
+            <w:tcW w:type="dxa" w:w="2160"/>
+            <w:shd w:fill="D9D9D9"/>
             <w:tcMar>
-              <w:top w:w="25" w:type="dxa"/>
-              <w:bottom w:w="25" w:type="dxa"/>
+              <w:top w:w="20" w:type="dxa"/>
+              <w:bottom w:w="20" w:type="dxa"/>
               <w:left w:w="40" w:type="dxa"/>
               <w:right w:w="40" w:type="dxa"/>
             </w:tcMar>
-            <w:shd w:fill="E8E8E8"/>
+            <w:hMerge w:val="restart"/>
           </w:tcPr>
           <w:p>
             <w:pPr>
@@ -3264,18 +3425,73 @@
               <w:rPr>
                 <w:rFonts w:ascii="Times New Roman" w:hAnsi="Times New Roman"/>
                 <w:b/>
-                <w:i w:val="0"/>
                 <w:sz w:val="14"/>
               </w:rPr>
               <w:t>Weekly Surface Sampling of Cleanroom Suite 115 (E001737) with Processing BSC</w:t>
             </w:r>
           </w:p>
         </w:tc>
+        <w:tc>
+          <w:tcPr>
+            <w:tcW w:type="dxa" w:w="792"/>
+            <w:hMerge w:val="continue"/>
+          </w:tcPr>
+          <w:p/>
+        </w:tc>
+        <w:tc>
+          <w:tcPr>
+            <w:tcW w:type="dxa" w:w="864"/>
+            <w:hMerge w:val="continue"/>
+          </w:tcPr>
+          <w:p/>
+        </w:tc>
+        <w:tc>
+          <w:tcPr>
+            <w:tcW w:type="dxa" w:w="720"/>
+            <w:hMerge w:val="continue"/>
+          </w:tcPr>
+          <w:p/>
+        </w:tc>
+        <w:tc>
+          <w:tcPr>
+            <w:tcW w:type="dxa" w:w="1224"/>
+            <w:hMerge w:val="continue"/>
+          </w:tcPr>
+          <w:p/>
+        </w:tc>
+        <w:tc>
+          <w:tcPr>
+            <w:tcW w:type="dxa" w:w="1224"/>
+            <w:hMerge w:val="continue"/>
+          </w:tcPr>
+          <w:p/>
+        </w:tc>
+        <w:tc>
+          <w:tcPr>
+            <w:tcW w:type="dxa" w:w="1224"/>
+            <w:hMerge w:val="continue"/>
+          </w:tcPr>
+          <w:p/>
+        </w:tc>
+        <w:tc>
+          <w:tcPr>
+            <w:tcW w:type="dxa" w:w="1944"/>
+            <w:hMerge w:val="continue"/>
+          </w:tcPr>
+          <w:p/>
+        </w:tc>
+        <w:tc>
+          <w:tcPr>
+            <w:tcW w:type="dxa" w:w="648"/>
+            <w:hMerge w:val="continue"/>
+          </w:tcPr>
+          <w:p/>
+        </w:tc>
       </w:tr>
       <w:tr>
         <w:tc>
           <w:tcPr>
-            <w:tcW w:type="dxa" w:w="1728"/>
+            <w:tcW w:type="dxa" w:w="2160"/>
             <w:vAlign w:val="center"/>
             <w:tcMar>
               <w:top w:w="25" w:type="dxa"/>
@@ -3383,7 +3599,7 @@
         </w:tc>
         <w:tc>
           <w:tcPr>
-            <w:tcW w:type="dxa" w:w="1368"/>
+            <w:tcW w:type="dxa" w:w="1224"/>
             <w:vAlign w:val="center"/>
             <w:tcMar>
               <w:top w:w="25" w:type="dxa"/>
@@ -3410,7 +3626,7 @@
         </w:tc>
         <w:tc>
           <w:tcPr>
-            <w:tcW w:type="dxa" w:w="1368"/>
+            <w:tcW w:type="dxa" w:w="1224"/>
             <w:vAlign w:val="center"/>
             <w:tcMar>
               <w:top w:w="25" w:type="dxa"/>
@@ -3437,7 +3653,7 @@
         </w:tc>
         <w:tc>
           <w:tcPr>
-            <w:tcW w:type="dxa" w:w="1368"/>
+            <w:tcW w:type="dxa" w:w="1224"/>
             <w:vAlign w:val="center"/>
             <w:tcMar>
               <w:top w:w="25" w:type="dxa"/>
@@ -3462,7 +3678,7 @@
         </w:tc>
         <w:tc>
           <w:tcPr>
-            <w:tcW w:type="dxa" w:w="1728"/>
+            <w:tcW w:type="dxa" w:w="1944"/>
             <w:vAlign w:val="center"/>
             <w:tcMar>
               <w:top w:w="25" w:type="dxa"/>
@@ -3479,8 +3695,6 @@
             <w:r>
               <w:rPr>
                 <w:rFonts w:ascii="Times New Roman" w:hAnsi="Times New Roman"/>
-                <w:b w:val="0"/>
-                <w:i w:val="0"/>
                 <w:sz w:val="14"/>
               </w:rPr>
               <w:t>Not Applicable</w:t>
@@ -3489,7 +3703,7 @@
         </w:tc>
         <w:tc>
           <w:tcPr>
-            <w:tcW w:type="dxa" w:w="864"/>
+            <w:tcW w:type="dxa" w:w="648"/>
             <w:vAlign w:val="center"/>
             <w:tcMar>
               <w:top w:w="25" w:type="dxa"/>

</xml_diff>

<commit_message>
fix(tables): separate Kocuria species, remove redundant interview sentence, and correct manager notified to Kathan Parikh
</commit_message>
<xml_diff>
--- a/Tables OOS-262329 GoGoMeds Select (E10747) - USP71.docx
+++ b/Tables OOS-262329 GoGoMeds Select (E10747) - USP71.docx
@@ -3338,14 +3338,8 @@
                 <w:sz w:val="14"/>
               </w:rPr>
               <w:t>Kocuria indica</w:t>
-            </w:r>
-            <w:r>
-              <w:rPr>
-                <w:rFonts w:ascii="Times New Roman" w:hAnsi="Times New Roman"/>
-                <w:i w:val="0"/>
-                <w:sz w:val="14"/>
-              </w:rPr>
-              <w:t xml:space="preserve"> and </w:t>
+              <w:br/>
+              <w:br/>
             </w:r>
             <w:r>
               <w:rPr>
@@ -3354,14 +3348,6 @@
                 <w:sz w:val="14"/>
               </w:rPr>
               <w:t>Kocuria rhizophila</w:t>
-            </w:r>
-            <w:r>
-              <w:rPr>
-                <w:rFonts w:ascii="Times New Roman" w:hAnsi="Times New Roman"/>
-                <w:i w:val="0"/>
-                <w:sz w:val="14"/>
-              </w:rPr>
-              <w:t xml:space="preserve"> (1 CFU)</w:t>
               <w:br/>
               <w:br/>
             </w:r>

</xml_diff>